<commit_message>
PRD: private PIN uses the native secure field, not a custom keypad
A custom keypad lets screen readers speak each key label during
explore-by-touch, which would expose the PIN.

Co-Authored-By: Claude Opus 5.5 <noreply@anthropic.com>
Claude-Session: https://claude.ai/code/session_01Q1Er2wXN9yzs1NYqdHkqvC
</commit_message>
<xml_diff>
--- a/docs/WAYMARK-Master-PRD-v1.0.docx
+++ b/docs/WAYMARK-Master-PRD-v1.0.docx
@@ -2528,7 +2528,7 @@
         <w:t xml:space="preserve">2. Private PIN entry (supporting).</w:t>
       </w:r>
       <w:r>
-        <w:t xml:space="preserve"> The demo PIN keypad never echoes digits. It announces "digit 2 of 4 entered", not the digit. Keys stay in a fixed phone-keypad layout; randomised keypads are not used because blind users cannot learn them. A short warning before PIN entry says that anyone nearby may hear your screen reader.</w:t>
+        <w:t xml:space="preserve"> The demo PIN uses the phone's own secure password field, which TalkBack and VoiceOver do not read back. WAYMARK announces only "2 of 4 digits entered". A custom on-screen keypad is not used: screen readers speak each key's label as the finger explores it, which would expose the PIN. Randomised keypads are not used either, because blind users cannot learn them. A short warning before PIN entry says that anyone nearby may hear your screen reader.</w:t>
       </w:r>
     </w:p>
     <w:p>
@@ -6254,7 +6254,7 @@
                 <w:sz w:val="18"/>
                 <w:szCs w:val="18"/>
               </w:rPr>
-              <w:t xml:space="preserve">Keypad announces progress, never digits. Fixed layout. Pre-entry privacy warning.</w:t>
+              <w:t xml:space="preserve">Native secure password field, so the screen reader does not speak digits; WAYMARK announces progress only. No custom or randomised keypad. Pre-entry privacy warning.</w:t>
             </w:r>
           </w:p>
         </w:tc>

</xml_diff>

<commit_message>
Sign in with any valid Nigerian mobile number
Accept 11-digit numbers starting 070, 071, 080, 081, 090 or 091, or
+234/234 forms, instead of one fixed demo number. The number is held in
memory during sign-in only and never stored. The code screen reads back
the last four digits. PRD FR-03, scope and J1 updated to match.

Co-Authored-By: Claude Opus 5.5 <noreply@anthropic.com>
Claude-Session: https://claude.ai/code/session_01Q1Er2wXN9yzs1NYqdHkqvC
</commit_message>
<xml_diff>
--- a/docs/WAYMARK-Master-PRD-v1.0.docx
+++ b/docs/WAYMARK-Master-PRD-v1.0.docx
@@ -2575,10 +2575,10 @@
         <w:tblLayout w:type="fixed"/>
       </w:tblPr>
       <w:tblGrid>
-        <w:gridCol w:w="2156"/>
-        <w:gridCol w:w="401"/>
-        <w:gridCol w:w="3409"/>
-        <w:gridCol w:w="3060"/>
+        <w:gridCol w:w="2032"/>
+        <w:gridCol w:w="378"/>
+        <w:gridCol w:w="3307"/>
+        <w:gridCol w:w="3309"/>
       </w:tblGrid>
       <w:tr>
         <w:trPr>
@@ -2586,7 +2586,7 @@
         </w:trPr>
         <w:tc>
           <w:tcPr>
-            <w:tcW w:type="dxa" w:w="2156"/>
+            <w:tcW w:type="dxa" w:w="2032"/>
             <w:tcBorders>
               <w:top w:val="single" w:color="D9DDD6" w:sz="4"/>
               <w:left w:val="single" w:color="D9DDD6" w:sz="4"/>
@@ -2619,7 +2619,7 @@
         </w:tc>
         <w:tc>
           <w:tcPr>
-            <w:tcW w:type="dxa" w:w="401"/>
+            <w:tcW w:type="dxa" w:w="378"/>
             <w:tcBorders>
               <w:top w:val="single" w:color="D9DDD6" w:sz="4"/>
               <w:left w:val="single" w:color="D9DDD6" w:sz="4"/>
@@ -2652,7 +2652,7 @@
         </w:tc>
         <w:tc>
           <w:tcPr>
-            <w:tcW w:type="dxa" w:w="3409"/>
+            <w:tcW w:type="dxa" w:w="3307"/>
             <w:tcBorders>
               <w:top w:val="single" w:color="D9DDD6" w:sz="4"/>
               <w:left w:val="single" w:color="D9DDD6" w:sz="4"/>
@@ -2685,7 +2685,7 @@
         </w:tc>
         <w:tc>
           <w:tcPr>
-            <w:tcW w:type="dxa" w:w="3060"/>
+            <w:tcW w:type="dxa" w:w="3309"/>
             <w:tcBorders>
               <w:top w:val="single" w:color="D9DDD6" w:sz="4"/>
               <w:left w:val="single" w:color="D9DDD6" w:sz="4"/>
@@ -2723,7 +2723,7 @@
         </w:trPr>
         <w:tc>
           <w:tcPr>
-            <w:tcW w:type="dxa" w:w="2156"/>
+            <w:tcW w:type="dxa" w:w="2032"/>
             <w:tcBorders>
               <w:top w:val="single" w:color="D9DDD6" w:sz="4"/>
               <w:left w:val="single" w:color="D9DDD6" w:sz="4"/>
@@ -2755,7 +2755,7 @@
         </w:tc>
         <w:tc>
           <w:tcPr>
-            <w:tcW w:type="dxa" w:w="401"/>
+            <w:tcW w:type="dxa" w:w="378"/>
             <w:tcBorders>
               <w:top w:val="single" w:color="D9DDD6" w:sz="4"/>
               <w:left w:val="single" w:color="D9DDD6" w:sz="4"/>
@@ -2785,7 +2785,7 @@
         </w:tc>
         <w:tc>
           <w:tcPr>
-            <w:tcW w:type="dxa" w:w="3409"/>
+            <w:tcW w:type="dxa" w:w="3307"/>
             <w:tcBorders>
               <w:top w:val="single" w:color="D9DDD6" w:sz="4"/>
               <w:left w:val="single" w:color="D9DDD6" w:sz="4"/>
@@ -2815,7 +2815,7 @@
         </w:tc>
         <w:tc>
           <w:tcPr>
-            <w:tcW w:type="dxa" w:w="3060"/>
+            <w:tcW w:type="dxa" w:w="3309"/>
             <w:tcBorders>
               <w:top w:val="single" w:color="D9DDD6" w:sz="4"/>
               <w:left w:val="single" w:color="D9DDD6" w:sz="4"/>
@@ -2850,7 +2850,7 @@
         </w:trPr>
         <w:tc>
           <w:tcPr>
-            <w:tcW w:type="dxa" w:w="2156"/>
+            <w:tcW w:type="dxa" w:w="2032"/>
             <w:tcBorders>
               <w:top w:val="single" w:color="D9DDD6" w:sz="4"/>
               <w:left w:val="single" w:color="D9DDD6" w:sz="4"/>
@@ -2882,7 +2882,7 @@
         </w:tc>
         <w:tc>
           <w:tcPr>
-            <w:tcW w:type="dxa" w:w="401"/>
+            <w:tcW w:type="dxa" w:w="378"/>
             <w:tcBorders>
               <w:top w:val="single" w:color="D9DDD6" w:sz="4"/>
               <w:left w:val="single" w:color="D9DDD6" w:sz="4"/>
@@ -2912,61 +2912,61 @@
         </w:tc>
         <w:tc>
           <w:tcPr>
-            <w:tcW w:type="dxa" w:w="3409"/>
-            <w:tcBorders>
-              <w:top w:val="single" w:color="D9DDD6" w:sz="4"/>
-              <w:left w:val="single" w:color="D9DDD6" w:sz="4"/>
-              <w:bottom w:val="single" w:color="D9DDD6" w:sz="4"/>
-              <w:right w:val="single" w:color="D9DDD6" w:sz="4"/>
-            </w:tcBorders>
-            <w:tcMar>
-              <w:top w:type="dxa" w:w="60"/>
-              <w:left w:type="dxa" w:w="100"/>
-              <w:bottom w:type="dxa" w:w="60"/>
-              <w:right w:type="dxa" w:w="100"/>
-            </w:tcMar>
-          </w:tcPr>
-          <w:p>
-            <w:pPr>
-              <w:spacing w:after="0" w:before="0"/>
-            </w:pPr>
-            <w:r>
-              <w:rPr>
-                <w:color w:val="18201C"/>
-                <w:sz w:val="18"/>
-                <w:szCs w:val="18"/>
-              </w:rPr>
-              <w:t xml:space="preserve">Demo phone number, demo OTP with no expiry pressure, demo PIN set-up</w:t>
-            </w:r>
-          </w:p>
-        </w:tc>
-        <w:tc>
-          <w:tcPr>
-            <w:tcW w:type="dxa" w:w="3060"/>
-            <w:tcBorders>
-              <w:top w:val="single" w:color="D9DDD6" w:sz="4"/>
-              <w:left w:val="single" w:color="D9DDD6" w:sz="4"/>
-              <w:bottom w:val="single" w:color="D9DDD6" w:sz="4"/>
-              <w:right w:val="single" w:color="D9DDD6" w:sz="4"/>
-            </w:tcBorders>
-            <w:tcMar>
-              <w:top w:type="dxa" w:w="60"/>
-              <w:left w:type="dxa" w:w="100"/>
-              <w:bottom w:type="dxa" w:w="60"/>
-              <w:right w:type="dxa" w:w="100"/>
-            </w:tcMar>
-          </w:tcPr>
-          <w:p>
-            <w:pPr>
-              <w:spacing w:after="0" w:before="0"/>
-            </w:pPr>
-            <w:r>
-              <w:rPr>
-                <w:color w:val="18201C"/>
-                <w:sz w:val="18"/>
-                <w:szCs w:val="18"/>
-              </w:rPr>
-              <w:t xml:space="preserve">Values are printed on screen; real credentials never accepted</w:t>
+            <w:tcW w:type="dxa" w:w="3307"/>
+            <w:tcBorders>
+              <w:top w:val="single" w:color="D9DDD6" w:sz="4"/>
+              <w:left w:val="single" w:color="D9DDD6" w:sz="4"/>
+              <w:bottom w:val="single" w:color="D9DDD6" w:sz="4"/>
+              <w:right w:val="single" w:color="D9DDD6" w:sz="4"/>
+            </w:tcBorders>
+            <w:tcMar>
+              <w:top w:type="dxa" w:w="60"/>
+              <w:left w:type="dxa" w:w="100"/>
+              <w:bottom w:type="dxa" w:w="60"/>
+              <w:right w:type="dxa" w:w="100"/>
+            </w:tcMar>
+          </w:tcPr>
+          <w:p>
+            <w:pPr>
+              <w:spacing w:after="0" w:before="0"/>
+            </w:pPr>
+            <w:r>
+              <w:rPr>
+                <w:color w:val="18201C"/>
+                <w:sz w:val="18"/>
+                <w:szCs w:val="18"/>
+              </w:rPr>
+              <w:t xml:space="preserve">Any valid Nigerian mobile number, demo OTP with no expiry pressure, demo PIN set-up</w:t>
+            </w:r>
+          </w:p>
+        </w:tc>
+        <w:tc>
+          <w:tcPr>
+            <w:tcW w:type="dxa" w:w="3309"/>
+            <w:tcBorders>
+              <w:top w:val="single" w:color="D9DDD6" w:sz="4"/>
+              <w:left w:val="single" w:color="D9DDD6" w:sz="4"/>
+              <w:bottom w:val="single" w:color="D9DDD6" w:sz="4"/>
+              <w:right w:val="single" w:color="D9DDD6" w:sz="4"/>
+            </w:tcBorders>
+            <w:tcMar>
+              <w:top w:type="dxa" w:w="60"/>
+              <w:left w:type="dxa" w:w="100"/>
+              <w:bottom w:type="dxa" w:w="60"/>
+              <w:right w:type="dxa" w:w="100"/>
+            </w:tcMar>
+          </w:tcPr>
+          <w:p>
+            <w:pPr>
+              <w:spacing w:after="0" w:before="0"/>
+            </w:pPr>
+            <w:r>
+              <w:rPr>
+                <w:color w:val="18201C"/>
+                <w:sz w:val="18"/>
+                <w:szCs w:val="18"/>
+              </w:rPr>
+              <w:t xml:space="preserve">Number is checked for format only and never stored; code is printed on screen; real credentials never accepted</w:t>
             </w:r>
           </w:p>
         </w:tc>
@@ -2977,7 +2977,7 @@
         </w:trPr>
         <w:tc>
           <w:tcPr>
-            <w:tcW w:type="dxa" w:w="2156"/>
+            <w:tcW w:type="dxa" w:w="2032"/>
             <w:tcBorders>
               <w:top w:val="single" w:color="D9DDD6" w:sz="4"/>
               <w:left w:val="single" w:color="D9DDD6" w:sz="4"/>
@@ -3009,7 +3009,7 @@
         </w:tc>
         <w:tc>
           <w:tcPr>
-            <w:tcW w:type="dxa" w:w="401"/>
+            <w:tcW w:type="dxa" w:w="378"/>
             <w:tcBorders>
               <w:top w:val="single" w:color="D9DDD6" w:sz="4"/>
               <w:left w:val="single" w:color="D9DDD6" w:sz="4"/>
@@ -3039,7 +3039,7 @@
         </w:tc>
         <w:tc>
           <w:tcPr>
-            <w:tcW w:type="dxa" w:w="3409"/>
+            <w:tcW w:type="dxa" w:w="3307"/>
             <w:tcBorders>
               <w:top w:val="single" w:color="D9DDD6" w:sz="4"/>
               <w:left w:val="single" w:color="D9DDD6" w:sz="4"/>
@@ -3069,7 +3069,7 @@
         </w:tc>
         <w:tc>
           <w:tcPr>
-            <w:tcW w:type="dxa" w:w="3060"/>
+            <w:tcW w:type="dxa" w:w="3309"/>
             <w:tcBorders>
               <w:top w:val="single" w:color="D9DDD6" w:sz="4"/>
               <w:left w:val="single" w:color="D9DDD6" w:sz="4"/>
@@ -3104,7 +3104,7 @@
         </w:trPr>
         <w:tc>
           <w:tcPr>
-            <w:tcW w:type="dxa" w:w="2156"/>
+            <w:tcW w:type="dxa" w:w="2032"/>
             <w:tcBorders>
               <w:top w:val="single" w:color="D9DDD6" w:sz="4"/>
               <w:left w:val="single" w:color="D9DDD6" w:sz="4"/>
@@ -3136,7 +3136,7 @@
         </w:tc>
         <w:tc>
           <w:tcPr>
-            <w:tcW w:type="dxa" w:w="401"/>
+            <w:tcW w:type="dxa" w:w="378"/>
             <w:tcBorders>
               <w:top w:val="single" w:color="D9DDD6" w:sz="4"/>
               <w:left w:val="single" w:color="D9DDD6" w:sz="4"/>
@@ -3166,7 +3166,7 @@
         </w:tc>
         <w:tc>
           <w:tcPr>
-            <w:tcW w:type="dxa" w:w="3409"/>
+            <w:tcW w:type="dxa" w:w="3307"/>
             <w:tcBorders>
               <w:top w:val="single" w:color="D9DDD6" w:sz="4"/>
               <w:left w:val="single" w:color="D9DDD6" w:sz="4"/>
@@ -3196,7 +3196,7 @@
         </w:tc>
         <w:tc>
           <w:tcPr>
-            <w:tcW w:type="dxa" w:w="3060"/>
+            <w:tcW w:type="dxa" w:w="3309"/>
             <w:tcBorders>
               <w:top w:val="single" w:color="D9DDD6" w:sz="4"/>
               <w:left w:val="single" w:color="D9DDD6" w:sz="4"/>
@@ -3231,7 +3231,7 @@
         </w:trPr>
         <w:tc>
           <w:tcPr>
-            <w:tcW w:type="dxa" w:w="2156"/>
+            <w:tcW w:type="dxa" w:w="2032"/>
             <w:tcBorders>
               <w:top w:val="single" w:color="D9DDD6" w:sz="4"/>
               <w:left w:val="single" w:color="D9DDD6" w:sz="4"/>
@@ -3263,7 +3263,7 @@
         </w:tc>
         <w:tc>
           <w:tcPr>
-            <w:tcW w:type="dxa" w:w="401"/>
+            <w:tcW w:type="dxa" w:w="378"/>
             <w:tcBorders>
               <w:top w:val="single" w:color="D9DDD6" w:sz="4"/>
               <w:left w:val="single" w:color="D9DDD6" w:sz="4"/>
@@ -3293,7 +3293,7 @@
         </w:tc>
         <w:tc>
           <w:tcPr>
-            <w:tcW w:type="dxa" w:w="3409"/>
+            <w:tcW w:type="dxa" w:w="3307"/>
             <w:tcBorders>
               <w:top w:val="single" w:color="D9DDD6" w:sz="4"/>
               <w:left w:val="single" w:color="D9DDD6" w:sz="4"/>
@@ -3323,7 +3323,7 @@
         </w:tc>
         <w:tc>
           <w:tcPr>
-            <w:tcW w:type="dxa" w:w="3060"/>
+            <w:tcW w:type="dxa" w:w="3309"/>
             <w:tcBorders>
               <w:top w:val="single" w:color="D9DDD6" w:sz="4"/>
               <w:left w:val="single" w:color="D9DDD6" w:sz="4"/>
@@ -3358,7 +3358,7 @@
         </w:trPr>
         <w:tc>
           <w:tcPr>
-            <w:tcW w:type="dxa" w:w="2156"/>
+            <w:tcW w:type="dxa" w:w="2032"/>
             <w:tcBorders>
               <w:top w:val="single" w:color="D9DDD6" w:sz="4"/>
               <w:left w:val="single" w:color="D9DDD6" w:sz="4"/>
@@ -3390,7 +3390,7 @@
         </w:tc>
         <w:tc>
           <w:tcPr>
-            <w:tcW w:type="dxa" w:w="401"/>
+            <w:tcW w:type="dxa" w:w="378"/>
             <w:tcBorders>
               <w:top w:val="single" w:color="D9DDD6" w:sz="4"/>
               <w:left w:val="single" w:color="D9DDD6" w:sz="4"/>
@@ -3420,7 +3420,7 @@
         </w:tc>
         <w:tc>
           <w:tcPr>
-            <w:tcW w:type="dxa" w:w="3409"/>
+            <w:tcW w:type="dxa" w:w="3307"/>
             <w:tcBorders>
               <w:top w:val="single" w:color="D9DDD6" w:sz="4"/>
               <w:left w:val="single" w:color="D9DDD6" w:sz="4"/>
@@ -3450,7 +3450,7 @@
         </w:tc>
         <w:tc>
           <w:tcPr>
-            <w:tcW w:type="dxa" w:w="3060"/>
+            <w:tcW w:type="dxa" w:w="3309"/>
             <w:tcBorders>
               <w:top w:val="single" w:color="D9DDD6" w:sz="4"/>
               <w:left w:val="single" w:color="D9DDD6" w:sz="4"/>
@@ -3485,7 +3485,7 @@
         </w:trPr>
         <w:tc>
           <w:tcPr>
-            <w:tcW w:type="dxa" w:w="2156"/>
+            <w:tcW w:type="dxa" w:w="2032"/>
             <w:tcBorders>
               <w:top w:val="single" w:color="D9DDD6" w:sz="4"/>
               <w:left w:val="single" w:color="D9DDD6" w:sz="4"/>
@@ -3517,7 +3517,7 @@
         </w:tc>
         <w:tc>
           <w:tcPr>
-            <w:tcW w:type="dxa" w:w="401"/>
+            <w:tcW w:type="dxa" w:w="378"/>
             <w:tcBorders>
               <w:top w:val="single" w:color="D9DDD6" w:sz="4"/>
               <w:left w:val="single" w:color="D9DDD6" w:sz="4"/>
@@ -3547,7 +3547,7 @@
         </w:tc>
         <w:tc>
           <w:tcPr>
-            <w:tcW w:type="dxa" w:w="3409"/>
+            <w:tcW w:type="dxa" w:w="3307"/>
             <w:tcBorders>
               <w:top w:val="single" w:color="D9DDD6" w:sz="4"/>
               <w:left w:val="single" w:color="D9DDD6" w:sz="4"/>
@@ -3577,7 +3577,7 @@
         </w:tc>
         <w:tc>
           <w:tcPr>
-            <w:tcW w:type="dxa" w:w="3060"/>
+            <w:tcW w:type="dxa" w:w="3309"/>
             <w:tcBorders>
               <w:top w:val="single" w:color="D9DDD6" w:sz="4"/>
               <w:left w:val="single" w:color="D9DDD6" w:sz="4"/>
@@ -3612,7 +3612,7 @@
         </w:trPr>
         <w:tc>
           <w:tcPr>
-            <w:tcW w:type="dxa" w:w="2156"/>
+            <w:tcW w:type="dxa" w:w="2032"/>
             <w:tcBorders>
               <w:top w:val="single" w:color="D9DDD6" w:sz="4"/>
               <w:left w:val="single" w:color="D9DDD6" w:sz="4"/>
@@ -3644,7 +3644,7 @@
         </w:tc>
         <w:tc>
           <w:tcPr>
-            <w:tcW w:type="dxa" w:w="401"/>
+            <w:tcW w:type="dxa" w:w="378"/>
             <w:tcBorders>
               <w:top w:val="single" w:color="D9DDD6" w:sz="4"/>
               <w:left w:val="single" w:color="D9DDD6" w:sz="4"/>
@@ -3674,7 +3674,7 @@
         </w:tc>
         <w:tc>
           <w:tcPr>
-            <w:tcW w:type="dxa" w:w="3409"/>
+            <w:tcW w:type="dxa" w:w="3307"/>
             <w:tcBorders>
               <w:top w:val="single" w:color="D9DDD6" w:sz="4"/>
               <w:left w:val="single" w:color="D9DDD6" w:sz="4"/>
@@ -3704,7 +3704,7 @@
         </w:tc>
         <w:tc>
           <w:tcPr>
-            <w:tcW w:type="dxa" w:w="3060"/>
+            <w:tcW w:type="dxa" w:w="3309"/>
             <w:tcBorders>
               <w:top w:val="single" w:color="D9DDD6" w:sz="4"/>
               <w:left w:val="single" w:color="D9DDD6" w:sz="4"/>
@@ -3739,7 +3739,7 @@
         </w:trPr>
         <w:tc>
           <w:tcPr>
-            <w:tcW w:type="dxa" w:w="2156"/>
+            <w:tcW w:type="dxa" w:w="2032"/>
             <w:tcBorders>
               <w:top w:val="single" w:color="D9DDD6" w:sz="4"/>
               <w:left w:val="single" w:color="D9DDD6" w:sz="4"/>
@@ -3771,7 +3771,7 @@
         </w:tc>
         <w:tc>
           <w:tcPr>
-            <w:tcW w:type="dxa" w:w="401"/>
+            <w:tcW w:type="dxa" w:w="378"/>
             <w:tcBorders>
               <w:top w:val="single" w:color="D9DDD6" w:sz="4"/>
               <w:left w:val="single" w:color="D9DDD6" w:sz="4"/>
@@ -3801,7 +3801,7 @@
         </w:tc>
         <w:tc>
           <w:tcPr>
-            <w:tcW w:type="dxa" w:w="3409"/>
+            <w:tcW w:type="dxa" w:w="3307"/>
             <w:tcBorders>
               <w:top w:val="single" w:color="D9DDD6" w:sz="4"/>
               <w:left w:val="single" w:color="D9DDD6" w:sz="4"/>
@@ -3831,7 +3831,7 @@
         </w:tc>
         <w:tc>
           <w:tcPr>
-            <w:tcW w:type="dxa" w:w="3060"/>
+            <w:tcW w:type="dxa" w:w="3309"/>
             <w:tcBorders>
               <w:top w:val="single" w:color="D9DDD6" w:sz="4"/>
               <w:left w:val="single" w:color="D9DDD6" w:sz="4"/>
@@ -3866,7 +3866,7 @@
         </w:trPr>
         <w:tc>
           <w:tcPr>
-            <w:tcW w:type="dxa" w:w="2156"/>
+            <w:tcW w:type="dxa" w:w="2032"/>
             <w:tcBorders>
               <w:top w:val="single" w:color="D9DDD6" w:sz="4"/>
               <w:left w:val="single" w:color="D9DDD6" w:sz="4"/>
@@ -3898,7 +3898,7 @@
         </w:tc>
         <w:tc>
           <w:tcPr>
-            <w:tcW w:type="dxa" w:w="401"/>
+            <w:tcW w:type="dxa" w:w="378"/>
             <w:tcBorders>
               <w:top w:val="single" w:color="D9DDD6" w:sz="4"/>
               <w:left w:val="single" w:color="D9DDD6" w:sz="4"/>
@@ -3928,7 +3928,7 @@
         </w:tc>
         <w:tc>
           <w:tcPr>
-            <w:tcW w:type="dxa" w:w="3409"/>
+            <w:tcW w:type="dxa" w:w="3307"/>
             <w:tcBorders>
               <w:top w:val="single" w:color="D9DDD6" w:sz="4"/>
               <w:left w:val="single" w:color="D9DDD6" w:sz="4"/>
@@ -3958,7 +3958,7 @@
         </w:tc>
         <w:tc>
           <w:tcPr>
-            <w:tcW w:type="dxa" w:w="3060"/>
+            <w:tcW w:type="dxa" w:w="3309"/>
             <w:tcBorders>
               <w:top w:val="single" w:color="D9DDD6" w:sz="4"/>
               <w:left w:val="single" w:color="D9DDD6" w:sz="4"/>
@@ -3985,7 +3985,7 @@
         </w:trPr>
         <w:tc>
           <w:tcPr>
-            <w:tcW w:type="dxa" w:w="2156"/>
+            <w:tcW w:type="dxa" w:w="2032"/>
             <w:tcBorders>
               <w:top w:val="single" w:color="D9DDD6" w:sz="4"/>
               <w:left w:val="single" w:color="D9DDD6" w:sz="4"/>
@@ -4017,7 +4017,7 @@
         </w:tc>
         <w:tc>
           <w:tcPr>
-            <w:tcW w:type="dxa" w:w="401"/>
+            <w:tcW w:type="dxa" w:w="378"/>
             <w:tcBorders>
               <w:top w:val="single" w:color="D9DDD6" w:sz="4"/>
               <w:left w:val="single" w:color="D9DDD6" w:sz="4"/>
@@ -4047,7 +4047,7 @@
         </w:tc>
         <w:tc>
           <w:tcPr>
-            <w:tcW w:type="dxa" w:w="3409"/>
+            <w:tcW w:type="dxa" w:w="3307"/>
             <w:tcBorders>
               <w:top w:val="single" w:color="D9DDD6" w:sz="4"/>
               <w:left w:val="single" w:color="D9DDD6" w:sz="4"/>
@@ -4077,7 +4077,7 @@
         </w:tc>
         <w:tc>
           <w:tcPr>
-            <w:tcW w:type="dxa" w:w="3060"/>
+            <w:tcW w:type="dxa" w:w="3309"/>
             <w:tcBorders>
               <w:top w:val="single" w:color="D9DDD6" w:sz="4"/>
               <w:left w:val="single" w:color="D9DDD6" w:sz="4"/>
@@ -4104,7 +4104,7 @@
         </w:trPr>
         <w:tc>
           <w:tcPr>
-            <w:tcW w:type="dxa" w:w="2156"/>
+            <w:tcW w:type="dxa" w:w="2032"/>
             <w:tcBorders>
               <w:top w:val="single" w:color="D9DDD6" w:sz="4"/>
               <w:left w:val="single" w:color="D9DDD6" w:sz="4"/>
@@ -4136,7 +4136,7 @@
         </w:tc>
         <w:tc>
           <w:tcPr>
-            <w:tcW w:type="dxa" w:w="401"/>
+            <w:tcW w:type="dxa" w:w="378"/>
             <w:tcBorders>
               <w:top w:val="single" w:color="D9DDD6" w:sz="4"/>
               <w:left w:val="single" w:color="D9DDD6" w:sz="4"/>
@@ -4166,7 +4166,7 @@
         </w:tc>
         <w:tc>
           <w:tcPr>
-            <w:tcW w:type="dxa" w:w="3409"/>
+            <w:tcW w:type="dxa" w:w="3307"/>
             <w:tcBorders>
               <w:top w:val="single" w:color="D9DDD6" w:sz="4"/>
               <w:left w:val="single" w:color="D9DDD6" w:sz="4"/>
@@ -4196,7 +4196,7 @@
         </w:tc>
         <w:tc>
           <w:tcPr>
-            <w:tcW w:type="dxa" w:w="3060"/>
+            <w:tcW w:type="dxa" w:w="3309"/>
             <w:tcBorders>
               <w:top w:val="single" w:color="D9DDD6" w:sz="4"/>
               <w:left w:val="single" w:color="D9DDD6" w:sz="4"/>
@@ -4223,7 +4223,7 @@
         </w:trPr>
         <w:tc>
           <w:tcPr>
-            <w:tcW w:type="dxa" w:w="2156"/>
+            <w:tcW w:type="dxa" w:w="2032"/>
             <w:tcBorders>
               <w:top w:val="single" w:color="D9DDD6" w:sz="4"/>
               <w:left w:val="single" w:color="D9DDD6" w:sz="4"/>
@@ -4255,7 +4255,7 @@
         </w:tc>
         <w:tc>
           <w:tcPr>
-            <w:tcW w:type="dxa" w:w="401"/>
+            <w:tcW w:type="dxa" w:w="378"/>
             <w:tcBorders>
               <w:top w:val="single" w:color="D9DDD6" w:sz="4"/>
               <w:left w:val="single" w:color="D9DDD6" w:sz="4"/>
@@ -4285,29 +4285,29 @@
         </w:tc>
         <w:tc>
           <w:tcPr>
-            <w:tcW w:type="dxa" w:w="3409"/>
-            <w:tcBorders>
-              <w:top w:val="single" w:color="D9DDD6" w:sz="4"/>
-              <w:left w:val="single" w:color="D9DDD6" w:sz="4"/>
-              <w:bottom w:val="single" w:color="D9DDD6" w:sz="4"/>
-              <w:right w:val="single" w:color="D9DDD6" w:sz="4"/>
-            </w:tcBorders>
-            <w:tcMar>
-              <w:top w:type="dxa" w:w="60"/>
-              <w:left w:type="dxa" w:w="100"/>
-              <w:bottom w:type="dxa" w:w="60"/>
-              <w:right w:type="dxa" w:w="100"/>
-            </w:tcMar>
-          </w:tcPr>
-          <w:p>
-            <w:pPr>
-              <w:spacing w:after="0" w:before="0"/>
-            </w:pPr>
-          </w:p>
-        </w:tc>
-        <w:tc>
-          <w:tcPr>
-            <w:tcW w:type="dxa" w:w="3060"/>
+            <w:tcW w:type="dxa" w:w="3307"/>
+            <w:tcBorders>
+              <w:top w:val="single" w:color="D9DDD6" w:sz="4"/>
+              <w:left w:val="single" w:color="D9DDD6" w:sz="4"/>
+              <w:bottom w:val="single" w:color="D9DDD6" w:sz="4"/>
+              <w:right w:val="single" w:color="D9DDD6" w:sz="4"/>
+            </w:tcBorders>
+            <w:tcMar>
+              <w:top w:type="dxa" w:w="60"/>
+              <w:left w:type="dxa" w:w="100"/>
+              <w:bottom w:type="dxa" w:w="60"/>
+              <w:right w:type="dxa" w:w="100"/>
+            </w:tcMar>
+          </w:tcPr>
+          <w:p>
+            <w:pPr>
+              <w:spacing w:after="0" w:before="0"/>
+            </w:pPr>
+          </w:p>
+        </w:tc>
+        <w:tc>
+          <w:tcPr>
+            <w:tcW w:type="dxa" w:w="3309"/>
             <w:tcBorders>
               <w:top w:val="single" w:color="D9DDD6" w:sz="4"/>
               <w:left w:val="single" w:color="D9DDD6" w:sz="4"/>
@@ -4342,7 +4342,7 @@
         </w:trPr>
         <w:tc>
           <w:tcPr>
-            <w:tcW w:type="dxa" w:w="2156"/>
+            <w:tcW w:type="dxa" w:w="2032"/>
             <w:tcBorders>
               <w:top w:val="single" w:color="D9DDD6" w:sz="4"/>
               <w:left w:val="single" w:color="D9DDD6" w:sz="4"/>
@@ -4374,7 +4374,7 @@
         </w:tc>
         <w:tc>
           <w:tcPr>
-            <w:tcW w:type="dxa" w:w="401"/>
+            <w:tcW w:type="dxa" w:w="378"/>
             <w:tcBorders>
               <w:top w:val="single" w:color="D9DDD6" w:sz="4"/>
               <w:left w:val="single" w:color="D9DDD6" w:sz="4"/>
@@ -4404,29 +4404,29 @@
         </w:tc>
         <w:tc>
           <w:tcPr>
-            <w:tcW w:type="dxa" w:w="3409"/>
-            <w:tcBorders>
-              <w:top w:val="single" w:color="D9DDD6" w:sz="4"/>
-              <w:left w:val="single" w:color="D9DDD6" w:sz="4"/>
-              <w:bottom w:val="single" w:color="D9DDD6" w:sz="4"/>
-              <w:right w:val="single" w:color="D9DDD6" w:sz="4"/>
-            </w:tcBorders>
-            <w:tcMar>
-              <w:top w:type="dxa" w:w="60"/>
-              <w:left w:type="dxa" w:w="100"/>
-              <w:bottom w:type="dxa" w:w="60"/>
-              <w:right w:type="dxa" w:w="100"/>
-            </w:tcMar>
-          </w:tcPr>
-          <w:p>
-            <w:pPr>
-              <w:spacing w:after="0" w:before="0"/>
-            </w:pPr>
-          </w:p>
-        </w:tc>
-        <w:tc>
-          <w:tcPr>
-            <w:tcW w:type="dxa" w:w="3060"/>
+            <w:tcW w:type="dxa" w:w="3307"/>
+            <w:tcBorders>
+              <w:top w:val="single" w:color="D9DDD6" w:sz="4"/>
+              <w:left w:val="single" w:color="D9DDD6" w:sz="4"/>
+              <w:bottom w:val="single" w:color="D9DDD6" w:sz="4"/>
+              <w:right w:val="single" w:color="D9DDD6" w:sz="4"/>
+            </w:tcBorders>
+            <w:tcMar>
+              <w:top w:type="dxa" w:w="60"/>
+              <w:left w:type="dxa" w:w="100"/>
+              <w:bottom w:type="dxa" w:w="60"/>
+              <w:right w:type="dxa" w:w="100"/>
+            </w:tcMar>
+          </w:tcPr>
+          <w:p>
+            <w:pPr>
+              <w:spacing w:after="0" w:before="0"/>
+            </w:pPr>
+          </w:p>
+        </w:tc>
+        <w:tc>
+          <w:tcPr>
+            <w:tcW w:type="dxa" w:w="3309"/>
             <w:tcBorders>
               <w:top w:val="single" w:color="D9DDD6" w:sz="4"/>
               <w:left w:val="single" w:color="D9DDD6" w:sz="4"/>
@@ -4453,7 +4453,7 @@
         </w:trPr>
         <w:tc>
           <w:tcPr>
-            <w:tcW w:type="dxa" w:w="2156"/>
+            <w:tcW w:type="dxa" w:w="2032"/>
             <w:tcBorders>
               <w:top w:val="single" w:color="D9DDD6" w:sz="4"/>
               <w:left w:val="single" w:color="D9DDD6" w:sz="4"/>
@@ -4485,7 +4485,7 @@
         </w:tc>
         <w:tc>
           <w:tcPr>
-            <w:tcW w:type="dxa" w:w="401"/>
+            <w:tcW w:type="dxa" w:w="378"/>
             <w:tcBorders>
               <w:top w:val="single" w:color="D9DDD6" w:sz="4"/>
               <w:left w:val="single" w:color="D9DDD6" w:sz="4"/>
@@ -4515,29 +4515,29 @@
         </w:tc>
         <w:tc>
           <w:tcPr>
-            <w:tcW w:type="dxa" w:w="3409"/>
-            <w:tcBorders>
-              <w:top w:val="single" w:color="D9DDD6" w:sz="4"/>
-              <w:left w:val="single" w:color="D9DDD6" w:sz="4"/>
-              <w:bottom w:val="single" w:color="D9DDD6" w:sz="4"/>
-              <w:right w:val="single" w:color="D9DDD6" w:sz="4"/>
-            </w:tcBorders>
-            <w:tcMar>
-              <w:top w:type="dxa" w:w="60"/>
-              <w:left w:type="dxa" w:w="100"/>
-              <w:bottom w:type="dxa" w:w="60"/>
-              <w:right w:type="dxa" w:w="100"/>
-            </w:tcMar>
-          </w:tcPr>
-          <w:p>
-            <w:pPr>
-              <w:spacing w:after="0" w:before="0"/>
-            </w:pPr>
-          </w:p>
-        </w:tc>
-        <w:tc>
-          <w:tcPr>
-            <w:tcW w:type="dxa" w:w="3060"/>
+            <w:tcW w:type="dxa" w:w="3307"/>
+            <w:tcBorders>
+              <w:top w:val="single" w:color="D9DDD6" w:sz="4"/>
+              <w:left w:val="single" w:color="D9DDD6" w:sz="4"/>
+              <w:bottom w:val="single" w:color="D9DDD6" w:sz="4"/>
+              <w:right w:val="single" w:color="D9DDD6" w:sz="4"/>
+            </w:tcBorders>
+            <w:tcMar>
+              <w:top w:type="dxa" w:w="60"/>
+              <w:left w:type="dxa" w:w="100"/>
+              <w:bottom w:type="dxa" w:w="60"/>
+              <w:right w:type="dxa" w:w="100"/>
+            </w:tcMar>
+          </w:tcPr>
+          <w:p>
+            <w:pPr>
+              <w:spacing w:after="0" w:before="0"/>
+            </w:pPr>
+          </w:p>
+        </w:tc>
+        <w:tc>
+          <w:tcPr>
+            <w:tcW w:type="dxa" w:w="3309"/>
             <w:tcBorders>
               <w:top w:val="single" w:color="D9DDD6" w:sz="4"/>
               <w:left w:val="single" w:color="D9DDD6" w:sz="4"/>
@@ -4601,7 +4601,7 @@
         <w:t xml:space="preserve">J1 Enter and sign in.</w:t>
       </w:r>
       <w:r>
-        <w:t xml:space="preserve"> Welcome screen explains the demo once. User enters the printed demo phone number and demo OTP. No countdown runs; if the user is idle, the OTP stays valid. User sets a 4-digit demo PIN using the private keypad.</w:t>
+        <w:t xml:space="preserve"> Welcome screen explains the demo once. User enters any Nigerian mobile number and the printed demo OTP. No countdown runs; if the user is idle, the OTP stays valid. User sets a 4-digit demo PIN using the private keypad.</w:t>
       </w:r>
     </w:p>
     <w:p>
@@ -5090,7 +5090,7 @@
                 <w:sz w:val="18"/>
                 <w:szCs w:val="18"/>
               </w:rPr>
-              <w:t xml:space="preserve">Phone number, OTP and PIN steps accept only the printed demo values. No timer, or a timer the user can extend.</w:t>
+              <w:t xml:space="preserve">Any valid Nigerian mobile number (070, 080, 081, 090 or 091, or +234) is accepted, held in memory only during sign-in. The code accepts only the printed demo value. No timer, or a timer the user can extend.</w:t>
             </w:r>
           </w:p>
         </w:tc>

</xml_diff>

<commit_message>
Add bank service boundary, transfer client and GitHub Pages deploy
Screens now reach the bank only through app/bank/bank-api.js. DemoBank
implements it in the browser with realistic delays and four behaviours
(normal, decline, hold, drop). The transfer client waits up to 6
seconds: no reply or a network error becomes Outcome unknown, resolved
only by a status check with the same idempotency key. Late replies are
ignored if the user has cancelled or moved on.

The Review screen's demo switch now sets bank behaviour instead of the
outcome. Adds 13 bank tests, pending and late-reply browser checks, a
Pages workflow that tests then publishes app/, and README/PRD updates.

Co-Authored-By: Claude Opus 5.5 <noreply@anthropic.com>
Claude-Session: https://claude.ai/code/session_01Q1Er2wXN9yzs1NYqdHkqvC
</commit_message>
<xml_diff>
--- a/docs/WAYMARK-Master-PRD-v1.0.docx
+++ b/docs/WAYMARK-Master-PRD-v1.0.docx
@@ -3601,7 +3601,7 @@
                 <w:sz w:val="18"/>
                 <w:szCs w:val="18"/>
               </w:rPr>
-              <w:t xml:space="preserve">Outcome chosen by a demo switch, disclosed</w:t>
+              <w:t xml:space="preserve">Demo bank behaviour chosen by a disclosed switch</w:t>
             </w:r>
           </w:p>
         </w:tc>
@@ -4696,7 +4696,7 @@
         <w:t xml:space="preserve">J6 Unknown outcome.</w:t>
       </w:r>
       <w:r>
-        <w:t xml:space="preserve"> With the demo switch set to Unknown, the outcome screen says "We could not confirm this transfer yet. Do not send it again." The only primary action is Check status. Checking resolves it to Completed, and activity shows one transfer.</w:t>
+        <w:t xml:space="preserve"> With Demo bank behaviour set to "The connection drops after sending", the app waits 6 seconds, then the outcome screen says "We could not confirm this transfer yet. Do not send it again." The only primary action is Check status. Checking resolves it to Completed, and activity shows one transfer.</w:t>
       </w:r>
     </w:p>
     <w:p>
@@ -8267,7 +8267,7 @@
         </w:numPr>
       </w:pPr>
       <w:r>
-        <w:t xml:space="preserve">A demo switch on the Review screen, labelled "Demo outcome", chooses Completed, Failed, Pending or Unknown so judges can see each path.</w:t>
+        <w:t xml:space="preserve">A switch on the Review screen, labelled "Demo bank behaviour", makes the demo bank complete, decline or hold the transfer, or drops the connection after sending. A dropped reply becomes Outcome unknown because the app gives up after 6 seconds, not because the switch says so.</w:t>
       </w:r>
     </w:p>
     <w:p>
@@ -8352,6 +8352,24 @@
       </w:r>
       <w:r>
         <w:t xml:space="preserve">: rendering, focus management, haptics.</w:t>
+      </w:r>
+    </w:p>
+    <w:p>
+      <w:pPr>
+        <w:pStyle w:val="ListParagraph"/>
+        <w:numPr>
+          <w:ilvl w:val="0"/>
+          <w:numId w:val="2"/>
+        </w:numPr>
+      </w:pPr>
+      <w:r>
+        <w:rPr>
+          <w:rFonts w:ascii="Consolas" w:cs="Consolas" w:eastAsia="Consolas" w:hAnsi="Consolas"/>
+        </w:rPr>
+        <w:t xml:space="preserve">app/bank/</w:t>
+      </w:r>
+      <w:r>
+        <w:t xml:space="preserve">: the bank boundary (account, activity, name lookup, fee quote, submit with idempotency key, status), the in-browser DemoBank behind it, and the transfer client that turns no reply within 6 seconds into Outcome unknown.</w:t>
       </w:r>
     </w:p>
     <w:p>
@@ -9187,7 +9205,7 @@
     </w:p>
     <w:p>
       <w:r>
-        <w:t xml:space="preserve">The production API boundary (quote, transfer with idempotency key, status lookup) goes in the pitch as one slide. It is not built.</w:t>
+        <w:t xml:space="preserve">The bank boundary in app/bank mirrors the production API (quote, transfer with idempotency key, status lookup). Going live means a second adapter with the same methods that calls the bank's authorised APIs; the screens do not change. That adapter is not built.</w:t>
       </w:r>
     </w:p>
     <w:p>

</xml_diff>

<commit_message>
PRD: voice first from sign-up, and the Gemini reader (FR-26, T-17, T-18)
Co-Authored-By: Claude Opus 5.5 <noreply@anthropic.com>
Claude-Session: https://claude.ai/code/session_01Q1Er2wXN9yzs1NYqdHkqvC
</commit_message>
<xml_diff>
--- a/docs/WAYMARK-Master-PRD-v1.0.docx
+++ b/docs/WAYMARK-Master-PRD-v1.0.docx
@@ -1208,7 +1208,7 @@
                 <w:sz w:val="18"/>
                 <w:szCs w:val="18"/>
               </w:rPr>
-              <w:t xml:space="preserve">Text size, contrast, reduced motion, haptics on or off. No custom speech engine.</w:t>
+              <w:t xml:space="preserve">Text size, contrast, reduced motion, haptics on or off. The Talk screen speaks with the phone's built-in voice; no custom speech engine.</w:t>
             </w:r>
           </w:p>
         </w:tc>
@@ -1590,6 +1590,133 @@
                 <w:szCs w:val="18"/>
               </w:rPr>
               <w:t xml:space="preserve">TalkBack on a low-cost Android phone first; VoiceOver second; NVDA on desktop third.</w:t>
+            </w:r>
+          </w:p>
+        </w:tc>
+      </w:tr>
+      <w:tr>
+        <w:trPr>
+          <w:cantSplit/>
+        </w:trPr>
+        <w:tc>
+          <w:tcPr>
+            <w:tcW w:type="dxa" w:w="2318"/>
+            <w:tcBorders>
+              <w:top w:val="single" w:color="D9DDD6" w:sz="4"/>
+              <w:left w:val="single" w:color="D9DDD6" w:sz="4"/>
+              <w:bottom w:val="single" w:color="D9DDD6" w:sz="4"/>
+              <w:right w:val="single" w:color="D9DDD6" w:sz="4"/>
+            </w:tcBorders>
+            <w:tcMar>
+              <w:top w:type="dxa" w:w="60"/>
+              <w:left w:type="dxa" w:w="100"/>
+              <w:bottom w:type="dxa" w:w="60"/>
+              <w:right w:type="dxa" w:w="100"/>
+            </w:tcMar>
+          </w:tcPr>
+          <w:p>
+            <w:pPr>
+              <w:spacing w:after="0" w:before="0"/>
+            </w:pPr>
+            <w:r>
+              <w:rPr>
+                <w:b/>
+                <w:bCs/>
+                <w:color w:val="18201C"/>
+                <w:sz w:val="18"/>
+                <w:szCs w:val="18"/>
+              </w:rPr>
+              <w:t xml:space="preserve">First screen</w:t>
+            </w:r>
+          </w:p>
+        </w:tc>
+        <w:tc>
+          <w:tcPr>
+            <w:tcW w:type="dxa" w:w="1479"/>
+            <w:tcBorders>
+              <w:top w:val="single" w:color="D9DDD6" w:sz="4"/>
+              <w:left w:val="single" w:color="D9DDD6" w:sz="4"/>
+              <w:bottom w:val="single" w:color="D9DDD6" w:sz="4"/>
+              <w:right w:val="single" w:color="D9DDD6" w:sz="4"/>
+            </w:tcBorders>
+            <w:tcMar>
+              <w:top w:type="dxa" w:w="60"/>
+              <w:left w:type="dxa" w:w="100"/>
+              <w:bottom w:type="dxa" w:w="60"/>
+              <w:right w:type="dxa" w:w="100"/>
+            </w:tcMar>
+          </w:tcPr>
+          <w:p>
+            <w:pPr>
+              <w:spacing w:after="0" w:before="0"/>
+            </w:pPr>
+            <w:r>
+              <w:rPr>
+                <w:color w:val="18201C"/>
+                <w:sz w:val="18"/>
+                <w:szCs w:val="18"/>
+              </w:rPr>
+              <w:t xml:space="preserve">Not specified</w:t>
+            </w:r>
+          </w:p>
+        </w:tc>
+        <w:tc>
+          <w:tcPr>
+            <w:tcW w:type="dxa" w:w="1775"/>
+            <w:tcBorders>
+              <w:top w:val="single" w:color="D9DDD6" w:sz="4"/>
+              <w:left w:val="single" w:color="D9DDD6" w:sz="4"/>
+              <w:bottom w:val="single" w:color="D9DDD6" w:sz="4"/>
+              <w:right w:val="single" w:color="D9DDD6" w:sz="4"/>
+            </w:tcBorders>
+            <w:tcMar>
+              <w:top w:type="dxa" w:w="60"/>
+              <w:left w:type="dxa" w:w="100"/>
+              <w:bottom w:type="dxa" w:w="60"/>
+              <w:right w:type="dxa" w:w="100"/>
+            </w:tcMar>
+          </w:tcPr>
+          <w:p>
+            <w:pPr>
+              <w:spacing w:after="0" w:before="0"/>
+            </w:pPr>
+            <w:r>
+              <w:rPr>
+                <w:color w:val="18201C"/>
+                <w:sz w:val="18"/>
+                <w:szCs w:val="18"/>
+              </w:rPr>
+              <w:t xml:space="preserve">Not specified</w:t>
+            </w:r>
+          </w:p>
+        </w:tc>
+        <w:tc>
+          <w:tcPr>
+            <w:tcW w:type="dxa" w:w="3454"/>
+            <w:tcBorders>
+              <w:top w:val="single" w:color="D9DDD6" w:sz="4"/>
+              <w:left w:val="single" w:color="D9DDD6" w:sz="4"/>
+              <w:bottom w:val="single" w:color="D9DDD6" w:sz="4"/>
+              <w:right w:val="single" w:color="D9DDD6" w:sz="4"/>
+            </w:tcBorders>
+            <w:tcMar>
+              <w:top w:type="dxa" w:w="60"/>
+              <w:left w:type="dxa" w:w="100"/>
+              <w:bottom w:type="dxa" w:w="60"/>
+              <w:right w:type="dxa" w:w="100"/>
+            </w:tcMar>
+          </w:tcPr>
+          <w:p>
+            <w:pPr>
+              <w:spacing w:after="0" w:before="0"/>
+            </w:pPr>
+            <w:r>
+              <w:rPr>
+                <w:color w:val="18201C"/>
+                <w:sz w:val="18"/>
+                <w:szCs w:val="18"/>
+              </w:rPr>
+              <w:t xml:space="preserve">Voice first: one large Talk button. WAYMARK speaks for itself, so no screen reader is needed. Sign-up, sign-in and payments work by voice; the screens remain for screen-reader users.</w:t>
             </w:r>
           </w:p>
         </w:tc>
@@ -1868,7 +1995,19 @@
         <w:t xml:space="preserve">Changed after the first TalkBack test (11 October 2026).</w:t>
       </w:r>
       <w:r>
-        <w:t xml:space="preserve"> A sighted tester using TalkBack completed a transfer but found it stressful: too many steps, "PIN" spelled out letter by letter, and PIN digits read aloud by the keyboard. Response: fingerprint approval replaces typed PINs, saved payees became one-tap buttons, and the Review screen now opens with a single summary sentence followed by the approve button. Voice commands followed: a Talk screen understands balance, recent activity and payments by saved name or by account number and bank. It reads back the account owner and continues only on a clear yes, opens Review for fingerprint approval, never sends money itself, and limits voice payments to 50,000 naira. Commands are read by on-phone rules today; a Claude-backed reader plugs into the same slot later.</w:t>
+        <w:t xml:space="preserve"> A sighted tester using TalkBack completed a transfer but found it stressful: too many steps, "PIN" spelled out letter by letter, and PIN digits read aloud by the keyboard. Response: fingerprint approval replaces typed PINs, saved payees became one-tap buttons, and the Review screen now opens with a single summary sentence followed by the approve button. Voice commands followed: a Talk screen understands balance, recent activity and payments by saved name or by account number and bank. It reads back the account owner and continues only on a clear yes, opens Review for fingerprint approval, never sends money itself, and limits voice payments to 50,000 naira. Commands were read by on-phone rules.</w:t>
+      </w:r>
+    </w:p>
+    <w:p>
+      <w:r>
+        <w:rPr>
+          <w:b/>
+          <w:bCs/>
+        </w:rPr>
+        <w:t xml:space="preserve">Changed again: voice first (12 October 2026).</w:t>
+      </w:r>
+      <w:r>
+        <w:t xml:space="preserve"> Depending on TalkBack was itself stressful, and voice had to start at sign-up, not after it. Response: the first screen is now one large button. Tapping anywhere makes WAYMARK speak with the phone's own voice and then listen, so no screen reader is needed. Sign-up is spoken: say your mobile number, say the code, then tap anywhere and touch the fingerprint sensor. A payment is read back from the bank's own figures and sent only by a tap plus fingerprint; "yes" alone never sends. Google Gemini now reads what was said, including Nigerian English and Pidgin, through a small Cloudflare Worker that holds the key. Only the sentence and the demo bank names are sent; balances and saved payees stay on the phone. If Gemini is slow or unavailable, the on-phone rules answer instead. Gemini never moves money, and the reader is not tied to one provider.</w:t>
       </w:r>
     </w:p>
     <w:p>
@@ -2557,7 +2696,19 @@
     </w:p>
     <w:p>
       <w:r>
-        <w:t xml:space="preserve">Why these three: each one targets a moment where blind users currently hand over their phone. A judge can see all three in a 90-second demo.</w:t>
+        <w:rPr>
+          <w:b/>
+          <w:bCs/>
+        </w:rPr>
+        <w:t xml:space="preserve">4. Voice first (supporting).</w:t>
+      </w:r>
+      <w:r>
+        <w:t xml:space="preserve"> The first screen is one large button: tap anywhere and WAYMARK talks you through sign-up, sign-in, balance, activity and payments, in its own voice, with no screen reader. Gemini understands natural speech and Pidgin. Sending still needs a tap and a fingerprint, and voice payments are capped at 50,000 naira.</w:t>
+      </w:r>
+    </w:p>
+    <w:p>
+      <w:r>
+        <w:t xml:space="preserve">Why these four: each one targets a moment where blind users currently hand over their phone. A judge can see all four in a 90-second demo.</w:t>
       </w:r>
     </w:p>
     <w:p>
@@ -2888,7 +3039,7 @@
                 <w:sz w:val="18"/>
                 <w:szCs w:val="18"/>
               </w:rPr>
-              <w:t xml:space="preserve">Simulated sign-in</w:t>
+              <w:t xml:space="preserve">Voice-first Talk screen</w:t>
             </w:r>
           </w:p>
         </w:tc>
@@ -2948,7 +3099,7 @@
                 <w:sz w:val="18"/>
                 <w:szCs w:val="18"/>
               </w:rPr>
-              <w:t xml:space="preserve">Any valid Nigerian mobile number, demo OTP with no expiry pressure, demo PIN set-up</w:t>
+              <w:t xml:space="preserve">Tap anywhere to talk; spoken sign-up, sign-in, balance, activity and payments up to 50,000 naira; Gemini reads what was said, with on-phone rules as fallback</w:t>
             </w:r>
           </w:p>
         </w:tc>
@@ -2978,7 +3129,7 @@
                 <w:sz w:val="18"/>
                 <w:szCs w:val="18"/>
               </w:rPr>
-              <w:t xml:space="preserve">Number is checked for format only and never stored; code is printed on screen; real credentials never accepted</w:t>
+              <w:t xml:space="preserve">Self-voicing, no screen reader needed; nothing is sent without a tap plus fingerprint</w:t>
             </w:r>
           </w:p>
         </w:tc>
@@ -3015,7 +3166,7 @@
                 <w:sz w:val="18"/>
                 <w:szCs w:val="18"/>
               </w:rPr>
-              <w:t xml:space="preserve">Home</w:t>
+              <w:t xml:space="preserve">Simulated sign-in</w:t>
             </w:r>
           </w:p>
         </w:tc>
@@ -3075,7 +3226,7 @@
                 <w:sz w:val="18"/>
                 <w:szCs w:val="18"/>
               </w:rPr>
-              <w:t xml:space="preserve">Demo balance, primary actions, three recent items</w:t>
+              <w:t xml:space="preserve">Any valid Nigerian mobile number, demo OTP with no expiry pressure, demo PIN set-up</w:t>
             </w:r>
           </w:p>
         </w:tc>
@@ -3105,7 +3256,7 @@
                 <w:sz w:val="18"/>
                 <w:szCs w:val="18"/>
               </w:rPr>
-              <w:t xml:space="preserve">Balance is not spoken automatically</w:t>
+              <w:t xml:space="preserve">Number is checked for format only and never stored; code is printed on screen; real credentials never accepted</w:t>
             </w:r>
           </w:p>
         </w:tc>
@@ -3142,7 +3293,7 @@
                 <w:sz w:val="18"/>
                 <w:szCs w:val="18"/>
               </w:rPr>
-              <w:t xml:space="preserve">Activity and detail</w:t>
+              <w:t xml:space="preserve">Home</w:t>
             </w:r>
           </w:p>
         </w:tc>
@@ -3202,7 +3353,7 @@
                 <w:sz w:val="18"/>
                 <w:szCs w:val="18"/>
               </w:rPr>
-              <w:t xml:space="preserve">Full list, detail view with reference and status</w:t>
+              <w:t xml:space="preserve">Demo balance, primary actions, three recent items</w:t>
             </w:r>
           </w:p>
         </w:tc>
@@ -3232,7 +3383,7 @@
                 <w:sz w:val="18"/>
                 <w:szCs w:val="18"/>
               </w:rPr>
-              <w:t xml:space="preserve">Synthetic only, no statements to download</w:t>
+              <w:t xml:space="preserve">Balance is not spoken automatically</w:t>
             </w:r>
           </w:p>
         </w:tc>
@@ -3269,7 +3420,7 @@
                 <w:sz w:val="18"/>
                 <w:szCs w:val="18"/>
               </w:rPr>
-              <w:t xml:space="preserve">Pay a new account</w:t>
+              <w:t xml:space="preserve">Activity and detail</w:t>
             </w:r>
           </w:p>
         </w:tc>
@@ -3329,7 +3480,7 @@
                 <w:sz w:val="18"/>
                 <w:szCs w:val="18"/>
               </w:rPr>
-              <w:t xml:space="preserve">NUBAN entry, bank picker, name lookup, lookalike warning</w:t>
+              <w:t xml:space="preserve">Full list, detail view with reference and status</w:t>
             </w:r>
           </w:p>
         </w:tc>
@@ -3359,7 +3510,7 @@
                 <w:sz w:val="18"/>
                 <w:szCs w:val="18"/>
               </w:rPr>
-              <w:t xml:space="preserve">Fictional directory of about 12 accounts</w:t>
+              <w:t xml:space="preserve">Synthetic only, no statements to download</w:t>
             </w:r>
           </w:p>
         </w:tc>
@@ -3396,7 +3547,7 @@
                 <w:sz w:val="18"/>
                 <w:szCs w:val="18"/>
               </w:rPr>
-              <w:t xml:space="preserve">Pay a saved beneficiary</w:t>
+              <w:t xml:space="preserve">Pay a new account</w:t>
             </w:r>
           </w:p>
         </w:tc>
@@ -3456,7 +3607,7 @@
                 <w:sz w:val="18"/>
                 <w:szCs w:val="18"/>
               </w:rPr>
-              <w:t xml:space="preserve">Native radio list of seeded beneficiaries</w:t>
+              <w:t xml:space="preserve">NUBAN entry, bank picker, name lookup, lookalike warning</w:t>
             </w:r>
           </w:p>
         </w:tc>
@@ -3486,7 +3637,7 @@
                 <w:sz w:val="18"/>
                 <w:szCs w:val="18"/>
               </w:rPr>
-              <w:t xml:space="preserve">No add or edit</w:t>
+              <w:t xml:space="preserve">Fictional directory of about 12 accounts</w:t>
             </w:r>
           </w:p>
         </w:tc>
@@ -3523,7 +3674,7 @@
                 <w:sz w:val="18"/>
                 <w:szCs w:val="18"/>
               </w:rPr>
-              <w:t xml:space="preserve">Review, PIN, outcome</w:t>
+              <w:t xml:space="preserve">Pay a saved beneficiary</w:t>
             </w:r>
           </w:p>
         </w:tc>
@@ -3583,7 +3734,7 @@
                 <w:sz w:val="18"/>
                 <w:szCs w:val="18"/>
               </w:rPr>
-              <w:t xml:space="preserve">Review, private PIN, simulated success, failure, pending, unknown</w:t>
+              <w:t xml:space="preserve">Native radio list of seeded beneficiaries</w:t>
             </w:r>
           </w:p>
         </w:tc>
@@ -3613,7 +3764,7 @@
                 <w:sz w:val="18"/>
                 <w:szCs w:val="18"/>
               </w:rPr>
-              <w:t xml:space="preserve">Demo bank behaviour chosen by a disclosed switch</w:t>
+              <w:t xml:space="preserve">No add or edit</w:t>
             </w:r>
           </w:p>
         </w:tc>
@@ -3650,7 +3801,7 @@
                 <w:sz w:val="18"/>
                 <w:szCs w:val="18"/>
               </w:rPr>
-              <w:t xml:space="preserve">Help</w:t>
+              <w:t xml:space="preserve">Review, PIN, outcome</w:t>
             </w:r>
           </w:p>
         </w:tc>
@@ -3710,7 +3861,7 @@
                 <w:sz w:val="18"/>
                 <w:szCs w:val="18"/>
               </w:rPr>
-              <w:t xml:space="preserve">Status meanings, demo limits, how to go back</w:t>
+              <w:t xml:space="preserve">Review, private PIN, simulated success, failure, pending, unknown</w:t>
             </w:r>
           </w:p>
         </w:tc>
@@ -3740,7 +3891,7 @@
                 <w:sz w:val="18"/>
                 <w:szCs w:val="18"/>
               </w:rPr>
-              <w:t xml:space="preserve">No phone numbers or live-support claims</w:t>
+              <w:t xml:space="preserve">Demo bank behaviour chosen by a disclosed switch</w:t>
             </w:r>
           </w:p>
         </w:tc>
@@ -3777,7 +3928,7 @@
                 <w:sz w:val="18"/>
                 <w:szCs w:val="18"/>
               </w:rPr>
-              <w:t xml:space="preserve">Settings</w:t>
+              <w:t xml:space="preserve">Help</w:t>
             </w:r>
           </w:p>
         </w:tc>
@@ -3837,7 +3988,7 @@
                 <w:sz w:val="18"/>
                 <w:szCs w:val="18"/>
               </w:rPr>
-              <w:t xml:space="preserve">Text size, high contrast, reduced motion, haptics</w:t>
+              <w:t xml:space="preserve">Status meanings, demo limits, how to go back</w:t>
             </w:r>
           </w:p>
         </w:tc>
@@ -3867,7 +4018,7 @@
                 <w:sz w:val="18"/>
                 <w:szCs w:val="18"/>
               </w:rPr>
-              <w:t xml:space="preserve">Never overrides OS settings</w:t>
+              <w:t xml:space="preserve">No phone numbers or live-support claims</w:t>
             </w:r>
           </w:p>
         </w:tc>
@@ -3904,7 +4055,7 @@
                 <w:sz w:val="18"/>
                 <w:szCs w:val="18"/>
               </w:rPr>
-              <w:t xml:space="preserve">Reset demo</w:t>
+              <w:t xml:space="preserve">Settings</w:t>
             </w:r>
           </w:p>
         </w:tc>
@@ -3964,7 +4115,7 @@
                 <w:sz w:val="18"/>
                 <w:szCs w:val="18"/>
               </w:rPr>
-              <w:t xml:space="preserve">One control restores seed data</w:t>
+              <w:t xml:space="preserve">Text size, high contrast, reduced motion, haptics</w:t>
             </w:r>
           </w:p>
         </w:tc>
@@ -3988,6 +4139,14 @@
             <w:pPr>
               <w:spacing w:after="0" w:before="0"/>
             </w:pPr>
+            <w:r>
+              <w:rPr>
+                <w:color w:val="18201C"/>
+                <w:sz w:val="18"/>
+                <w:szCs w:val="18"/>
+              </w:rPr>
+              <w:t xml:space="preserve">Never overrides OS settings</w:t>
+            </w:r>
           </w:p>
         </w:tc>
       </w:tr>
@@ -4023,7 +4182,7 @@
                 <w:sz w:val="18"/>
                 <w:szCs w:val="18"/>
               </w:rPr>
-              <w:t xml:space="preserve">Beneficiaries screen</w:t>
+              <w:t xml:space="preserve">Reset demo</w:t>
             </w:r>
           </w:p>
         </w:tc>
@@ -4053,7 +4212,7 @@
                 <w:sz w:val="18"/>
                 <w:szCs w:val="18"/>
               </w:rPr>
-              <w:t xml:space="preserve">Should</w:t>
+              <w:t xml:space="preserve">Must</w:t>
             </w:r>
           </w:p>
         </w:tc>
@@ -4083,7 +4242,7 @@
                 <w:sz w:val="18"/>
                 <w:szCs w:val="18"/>
               </w:rPr>
-              <w:t xml:space="preserve">Read-only list</w:t>
+              <w:t xml:space="preserve">One control restores seed data</w:t>
             </w:r>
           </w:p>
         </w:tc>
@@ -4142,7 +4301,7 @@
                 <w:sz w:val="18"/>
                 <w:szCs w:val="18"/>
               </w:rPr>
-              <w:t xml:space="preserve">Pidgin copy</w:t>
+              <w:t xml:space="preserve">Beneficiaries screen</w:t>
             </w:r>
           </w:p>
         </w:tc>
@@ -4172,7 +4331,7 @@
                 <w:sz w:val="18"/>
                 <w:szCs w:val="18"/>
               </w:rPr>
-              <w:t xml:space="preserve">Could</w:t>
+              <w:t xml:space="preserve">Should</w:t>
             </w:r>
           </w:p>
         </w:tc>
@@ -4202,7 +4361,7 @@
                 <w:sz w:val="18"/>
                 <w:szCs w:val="18"/>
               </w:rPr>
-              <w:t xml:space="preserve">Only if a native speaker reviews it</w:t>
+              <w:t xml:space="preserve">Read-only list</w:t>
             </w:r>
           </w:p>
         </w:tc>
@@ -4261,7 +4420,7 @@
                 <w:sz w:val="18"/>
                 <w:szCs w:val="18"/>
               </w:rPr>
-              <w:t xml:space="preserve">Real KYC, liveness, biometrics</w:t>
+              <w:t xml:space="preserve">Pidgin copy</w:t>
             </w:r>
           </w:p>
         </w:tc>
@@ -4291,7 +4450,7 @@
                 <w:sz w:val="18"/>
                 <w:szCs w:val="18"/>
               </w:rPr>
-              <w:t xml:space="preserve">Out</w:t>
+              <w:t xml:space="preserve">Could</w:t>
             </w:r>
           </w:p>
         </w:tc>
@@ -4315,6 +4474,14 @@
             <w:pPr>
               <w:spacing w:after="0" w:before="0"/>
             </w:pPr>
+            <w:r>
+              <w:rPr>
+                <w:color w:val="18201C"/>
+                <w:sz w:val="18"/>
+                <w:szCs w:val="18"/>
+              </w:rPr>
+              <w:t xml:space="preserve">Only if a native speaker reviews it</w:t>
+            </w:r>
           </w:p>
         </w:tc>
         <w:tc>
@@ -4337,14 +4504,6 @@
             <w:pPr>
               <w:spacing w:after="0" w:before="0"/>
             </w:pPr>
-            <w:r>
-              <w:rPr>
-                <w:color w:val="18201C"/>
-                <w:sz w:val="18"/>
-                <w:szCs w:val="18"/>
-              </w:rPr>
-              <w:t xml:space="preserve">Explained in pitch as next phase</w:t>
-            </w:r>
           </w:p>
         </w:tc>
       </w:tr>
@@ -4380,7 +4539,7 @@
                 <w:sz w:val="18"/>
                 <w:szCs w:val="18"/>
               </w:rPr>
-              <w:t xml:space="preserve">Bills, airtime, cards, loans, international</w:t>
+              <w:t xml:space="preserve">Real KYC, liveness, biometrics</w:t>
             </w:r>
           </w:p>
         </w:tc>
@@ -4456,6 +4615,14 @@
             <w:pPr>
               <w:spacing w:after="0" w:before="0"/>
             </w:pPr>
+            <w:r>
+              <w:rPr>
+                <w:color w:val="18201C"/>
+                <w:sz w:val="18"/>
+                <w:szCs w:val="18"/>
+              </w:rPr>
+              <w:t xml:space="preserve">Explained in pitch as next phase</w:t>
+            </w:r>
           </w:p>
         </w:tc>
       </w:tr>
@@ -4491,7 +4658,7 @@
                 <w:sz w:val="18"/>
                 <w:szCs w:val="18"/>
               </w:rPr>
-              <w:t xml:space="preserve">AI or voice agent that moves money</w:t>
+              <w:t xml:space="preserve">Bills, airtime, cards, loans, international</w:t>
             </w:r>
           </w:p>
         </w:tc>
@@ -4567,13 +4734,124 @@
             <w:pPr>
               <w:spacing w:after="0" w:before="0"/>
             </w:pPr>
-            <w:r>
-              <w:rPr>
-                <w:color w:val="18201C"/>
-                <w:sz w:val="18"/>
-                <w:szCs w:val="18"/>
-              </w:rPr>
-              <w:t xml:space="preserve">Speech input via OS tools only</w:t>
+          </w:p>
+        </w:tc>
+      </w:tr>
+      <w:tr>
+        <w:trPr>
+          <w:cantSplit/>
+        </w:trPr>
+        <w:tc>
+          <w:tcPr>
+            <w:tcW w:type="dxa" w:w="2032"/>
+            <w:tcBorders>
+              <w:top w:val="single" w:color="D9DDD6" w:sz="4"/>
+              <w:left w:val="single" w:color="D9DDD6" w:sz="4"/>
+              <w:bottom w:val="single" w:color="D9DDD6" w:sz="4"/>
+              <w:right w:val="single" w:color="D9DDD6" w:sz="4"/>
+            </w:tcBorders>
+            <w:tcMar>
+              <w:top w:type="dxa" w:w="60"/>
+              <w:left w:type="dxa" w:w="100"/>
+              <w:bottom w:type="dxa" w:w="60"/>
+              <w:right w:type="dxa" w:w="100"/>
+            </w:tcMar>
+          </w:tcPr>
+          <w:p>
+            <w:pPr>
+              <w:spacing w:after="0" w:before="0"/>
+            </w:pPr>
+            <w:r>
+              <w:rPr>
+                <w:b/>
+                <w:bCs/>
+                <w:color w:val="18201C"/>
+                <w:sz w:val="18"/>
+                <w:szCs w:val="18"/>
+              </w:rPr>
+              <w:t xml:space="preserve">AI that moves money</w:t>
+            </w:r>
+          </w:p>
+        </w:tc>
+        <w:tc>
+          <w:tcPr>
+            <w:tcW w:type="dxa" w:w="378"/>
+            <w:tcBorders>
+              <w:top w:val="single" w:color="D9DDD6" w:sz="4"/>
+              <w:left w:val="single" w:color="D9DDD6" w:sz="4"/>
+              <w:bottom w:val="single" w:color="D9DDD6" w:sz="4"/>
+              <w:right w:val="single" w:color="D9DDD6" w:sz="4"/>
+            </w:tcBorders>
+            <w:tcMar>
+              <w:top w:type="dxa" w:w="60"/>
+              <w:left w:type="dxa" w:w="100"/>
+              <w:bottom w:type="dxa" w:w="60"/>
+              <w:right w:type="dxa" w:w="100"/>
+            </w:tcMar>
+          </w:tcPr>
+          <w:p>
+            <w:pPr>
+              <w:spacing w:after="0" w:before="0"/>
+            </w:pPr>
+            <w:r>
+              <w:rPr>
+                <w:color w:val="18201C"/>
+                <w:sz w:val="18"/>
+                <w:szCs w:val="18"/>
+              </w:rPr>
+              <w:t xml:space="preserve">Out</w:t>
+            </w:r>
+          </w:p>
+        </w:tc>
+        <w:tc>
+          <w:tcPr>
+            <w:tcW w:type="dxa" w:w="3307"/>
+            <w:tcBorders>
+              <w:top w:val="single" w:color="D9DDD6" w:sz="4"/>
+              <w:left w:val="single" w:color="D9DDD6" w:sz="4"/>
+              <w:bottom w:val="single" w:color="D9DDD6" w:sz="4"/>
+              <w:right w:val="single" w:color="D9DDD6" w:sz="4"/>
+            </w:tcBorders>
+            <w:tcMar>
+              <w:top w:type="dxa" w:w="60"/>
+              <w:left w:type="dxa" w:w="100"/>
+              <w:bottom w:type="dxa" w:w="60"/>
+              <w:right w:type="dxa" w:w="100"/>
+            </w:tcMar>
+          </w:tcPr>
+          <w:p>
+            <w:pPr>
+              <w:spacing w:after="0" w:before="0"/>
+            </w:pPr>
+          </w:p>
+        </w:tc>
+        <w:tc>
+          <w:tcPr>
+            <w:tcW w:type="dxa" w:w="3309"/>
+            <w:tcBorders>
+              <w:top w:val="single" w:color="D9DDD6" w:sz="4"/>
+              <w:left w:val="single" w:color="D9DDD6" w:sz="4"/>
+              <w:bottom w:val="single" w:color="D9DDD6" w:sz="4"/>
+              <w:right w:val="single" w:color="D9DDD6" w:sz="4"/>
+            </w:tcBorders>
+            <w:tcMar>
+              <w:top w:type="dxa" w:w="60"/>
+              <w:left w:type="dxa" w:w="100"/>
+              <w:bottom w:type="dxa" w:w="60"/>
+              <w:right w:type="dxa" w:w="100"/>
+            </w:tcMar>
+          </w:tcPr>
+          <w:p>
+            <w:pPr>
+              <w:spacing w:after="0" w:before="0"/>
+            </w:pPr>
+            <w:r>
+              <w:rPr>
+                <w:color w:val="18201C"/>
+                <w:sz w:val="18"/>
+                <w:szCs w:val="18"/>
+              </w:rPr>
+              <w:t xml:space="preserve">Gemini only reads what was said; sending always needs a tap and a fingerprint</w:t>
             </w:r>
           </w:p>
         </w:tc>
@@ -7271,6 +7549,103 @@
           </w:p>
         </w:tc>
       </w:tr>
+      <w:tr>
+        <w:trPr>
+          <w:cantSplit/>
+        </w:trPr>
+        <w:tc>
+          <w:tcPr>
+            <w:tcW w:type="dxa" w:w="1413"/>
+            <w:tcBorders>
+              <w:top w:val="single" w:color="D9DDD6" w:sz="4"/>
+              <w:left w:val="single" w:color="D9DDD6" w:sz="4"/>
+              <w:bottom w:val="single" w:color="D9DDD6" w:sz="4"/>
+              <w:right w:val="single" w:color="D9DDD6" w:sz="4"/>
+            </w:tcBorders>
+            <w:tcMar>
+              <w:top w:type="dxa" w:w="60"/>
+              <w:left w:type="dxa" w:w="100"/>
+              <w:bottom w:type="dxa" w:w="60"/>
+              <w:right w:type="dxa" w:w="100"/>
+            </w:tcMar>
+          </w:tcPr>
+          <w:p>
+            <w:pPr>
+              <w:spacing w:after="0" w:before="0"/>
+            </w:pPr>
+            <w:r>
+              <w:rPr>
+                <w:b/>
+                <w:bCs/>
+                <w:color w:val="18201C"/>
+                <w:sz w:val="18"/>
+                <w:szCs w:val="18"/>
+              </w:rPr>
+              <w:t xml:space="preserve">FR-26 Voice first</w:t>
+            </w:r>
+          </w:p>
+        </w:tc>
+        <w:tc>
+          <w:tcPr>
+            <w:tcW w:type="dxa" w:w="3806"/>
+            <w:tcBorders>
+              <w:top w:val="single" w:color="D9DDD6" w:sz="4"/>
+              <w:left w:val="single" w:color="D9DDD6" w:sz="4"/>
+              <w:bottom w:val="single" w:color="D9DDD6" w:sz="4"/>
+              <w:right w:val="single" w:color="D9DDD6" w:sz="4"/>
+            </w:tcBorders>
+            <w:tcMar>
+              <w:top w:type="dxa" w:w="60"/>
+              <w:left w:type="dxa" w:w="100"/>
+              <w:bottom w:type="dxa" w:w="60"/>
+              <w:right w:type="dxa" w:w="100"/>
+            </w:tcMar>
+          </w:tcPr>
+          <w:p>
+            <w:pPr>
+              <w:spacing w:after="0" w:before="0"/>
+            </w:pPr>
+            <w:r>
+              <w:rPr>
+                <w:color w:val="18201C"/>
+                <w:sz w:val="18"/>
+                <w:szCs w:val="18"/>
+              </w:rPr>
+              <w:t xml:space="preserve">The first screen is one large button. A tap starts a spoken conversation in the phone's own voice: sign-up (phone number, code, fingerprint), sign-in, balance, activity and payments. A tap always interrupts. Gemini, behind a server that holds the key, reads what was said; only the sentence and demo bank names are sent, and on-phone rules answer if it is slow (4 seconds) or unavailable. Yes and no never leave the phone.</w:t>
+            </w:r>
+          </w:p>
+        </w:tc>
+        <w:tc>
+          <w:tcPr>
+            <w:tcW w:type="dxa" w:w="3807"/>
+            <w:tcBorders>
+              <w:top w:val="single" w:color="D9DDD6" w:sz="4"/>
+              <w:left w:val="single" w:color="D9DDD6" w:sz="4"/>
+              <w:bottom w:val="single" w:color="D9DDD6" w:sz="4"/>
+              <w:right w:val="single" w:color="D9DDD6" w:sz="4"/>
+            </w:tcBorders>
+            <w:tcMar>
+              <w:top w:type="dxa" w:w="60"/>
+              <w:left w:type="dxa" w:w="100"/>
+              <w:bottom w:type="dxa" w:w="60"/>
+              <w:right w:type="dxa" w:w="100"/>
+            </w:tcMar>
+          </w:tcPr>
+          <w:p>
+            <w:pPr>
+              <w:spacing w:after="0" w:before="0"/>
+            </w:pPr>
+            <w:r>
+              <w:rPr>
+                <w:color w:val="18201C"/>
+                <w:sz w:val="18"/>
+                <w:szCs w:val="18"/>
+              </w:rPr>
+              <w:t xml:space="preserve">A payment is read back from the bank's own figures and sent only after a tap plus fingerprint; "yes" alone never sends; voice payments over 50,000 naira are refused.</w:t>
+            </w:r>
+          </w:p>
+        </w:tc>
+      </w:tr>
     </w:tbl>
     <w:p>
       <w:pPr>
@@ -8173,7 +8548,7 @@
         </w:numPr>
       </w:pPr>
       <w:r>
-        <w:t xml:space="preserve">WAYMARK has no custom speech engine. It relies on the user's own screen reader at their own rate.</w:t>
+        <w:t xml:space="preserve">On the Talk screen WAYMARK speaks with the phone's own voice, so no screen reader is needed. Anyone nearby can hear it, so the balance is spoken only when asked, accounts only as the last four digits, and nothing secret is ever spoken. The screens rely on the user's own screen reader at their own rate.</w:t>
       </w:r>
     </w:p>
     <w:p>
@@ -9254,7 +9629,7 @@
         </w:numPr>
       </w:pPr>
       <w:r>
-        <w:t xml:space="preserve">No analytics, trackers or third-party requests. The page makes no network calls after load.</w:t>
+        <w:t xml:space="preserve">No analytics or trackers. The only network calls after load are speech-to-text (Chrome sends audio to Google) and, when switched on, the WAYMARK Worker, which sends the spoken sentence and demo bank names to Gemini. The Gemini key is a Cloudflare secret, never in the repository or the page. Help and the Talk screen say this.</w:t>
       </w:r>
     </w:p>
     <w:p>
@@ -9344,11 +9719,11 @@
         <w:tblLayout w:type="fixed"/>
       </w:tblPr>
       <w:tblGrid>
-        <w:gridCol w:w="596"/>
-        <w:gridCol w:w="596"/>
-        <w:gridCol w:w="3804"/>
-        <w:gridCol w:w="2983"/>
-        <w:gridCol w:w="1047"/>
+        <w:gridCol w:w="424"/>
+        <w:gridCol w:w="424"/>
+        <w:gridCol w:w="3716"/>
+        <w:gridCol w:w="3716"/>
+        <w:gridCol w:w="746"/>
       </w:tblGrid>
       <w:tr>
         <w:trPr>
@@ -9356,7 +9731,7 @@
         </w:trPr>
         <w:tc>
           <w:tcPr>
-            <w:tcW w:type="dxa" w:w="596"/>
+            <w:tcW w:type="dxa" w:w="424"/>
             <w:tcBorders>
               <w:top w:val="single" w:color="D9DDD6" w:sz="4"/>
               <w:left w:val="single" w:color="D9DDD6" w:sz="4"/>
@@ -9389,7 +9764,7 @@
         </w:tc>
         <w:tc>
           <w:tcPr>
-            <w:tcW w:type="dxa" w:w="596"/>
+            <w:tcW w:type="dxa" w:w="424"/>
             <w:tcBorders>
               <w:top w:val="single" w:color="D9DDD6" w:sz="4"/>
               <w:left w:val="single" w:color="D9DDD6" w:sz="4"/>
@@ -9422,7 +9797,7 @@
         </w:tc>
         <w:tc>
           <w:tcPr>
-            <w:tcW w:type="dxa" w:w="3804"/>
+            <w:tcW w:type="dxa" w:w="3716"/>
             <w:tcBorders>
               <w:top w:val="single" w:color="D9DDD6" w:sz="4"/>
               <w:left w:val="single" w:color="D9DDD6" w:sz="4"/>
@@ -9455,7 +9830,7 @@
         </w:tc>
         <w:tc>
           <w:tcPr>
-            <w:tcW w:type="dxa" w:w="2983"/>
+            <w:tcW w:type="dxa" w:w="3716"/>
             <w:tcBorders>
               <w:top w:val="single" w:color="D9DDD6" w:sz="4"/>
               <w:left w:val="single" w:color="D9DDD6" w:sz="4"/>
@@ -9488,7 +9863,7 @@
         </w:tc>
         <w:tc>
           <w:tcPr>
-            <w:tcW w:type="dxa" w:w="1047"/>
+            <w:tcW w:type="dxa" w:w="746"/>
             <w:tcBorders>
               <w:top w:val="single" w:color="D9DDD6" w:sz="4"/>
               <w:left w:val="single" w:color="D9DDD6" w:sz="4"/>
@@ -9526,7 +9901,7 @@
         </w:trPr>
         <w:tc>
           <w:tcPr>
-            <w:tcW w:type="dxa" w:w="596"/>
+            <w:tcW w:type="dxa" w:w="424"/>
             <w:tcBorders>
               <w:top w:val="single" w:color="D9DDD6" w:sz="4"/>
               <w:left w:val="single" w:color="D9DDD6" w:sz="4"/>
@@ -9558,7 +9933,7 @@
         </w:tc>
         <w:tc>
           <w:tcPr>
-            <w:tcW w:type="dxa" w:w="596"/>
+            <w:tcW w:type="dxa" w:w="424"/>
             <w:tcBorders>
               <w:top w:val="single" w:color="D9DDD6" w:sz="4"/>
               <w:left w:val="single" w:color="D9DDD6" w:sz="4"/>
@@ -9588,7 +9963,7 @@
         </w:tc>
         <w:tc>
           <w:tcPr>
-            <w:tcW w:type="dxa" w:w="3804"/>
+            <w:tcW w:type="dxa" w:w="3716"/>
             <w:tcBorders>
               <w:top w:val="single" w:color="D9DDD6" w:sz="4"/>
               <w:left w:val="single" w:color="D9DDD6" w:sz="4"/>
@@ -9618,7 +9993,7 @@
         </w:tc>
         <w:tc>
           <w:tcPr>
-            <w:tcW w:type="dxa" w:w="2983"/>
+            <w:tcW w:type="dxa" w:w="3716"/>
             <w:tcBorders>
               <w:top w:val="single" w:color="D9DDD6" w:sz="4"/>
               <w:left w:val="single" w:color="D9DDD6" w:sz="4"/>
@@ -9648,7 +10023,7 @@
         </w:tc>
         <w:tc>
           <w:tcPr>
-            <w:tcW w:type="dxa" w:w="1047"/>
+            <w:tcW w:type="dxa" w:w="746"/>
             <w:tcBorders>
               <w:top w:val="single" w:color="D9DDD6" w:sz="4"/>
               <w:left w:val="single" w:color="D9DDD6" w:sz="4"/>
@@ -9683,7 +10058,7 @@
         </w:trPr>
         <w:tc>
           <w:tcPr>
-            <w:tcW w:type="dxa" w:w="596"/>
+            <w:tcW w:type="dxa" w:w="424"/>
             <w:tcBorders>
               <w:top w:val="single" w:color="D9DDD6" w:sz="4"/>
               <w:left w:val="single" w:color="D9DDD6" w:sz="4"/>
@@ -9715,7 +10090,7 @@
         </w:tc>
         <w:tc>
           <w:tcPr>
-            <w:tcW w:type="dxa" w:w="596"/>
+            <w:tcW w:type="dxa" w:w="424"/>
             <w:tcBorders>
               <w:top w:val="single" w:color="D9DDD6" w:sz="4"/>
               <w:left w:val="single" w:color="D9DDD6" w:sz="4"/>
@@ -9745,7 +10120,7 @@
         </w:tc>
         <w:tc>
           <w:tcPr>
-            <w:tcW w:type="dxa" w:w="3804"/>
+            <w:tcW w:type="dxa" w:w="3716"/>
             <w:tcBorders>
               <w:top w:val="single" w:color="D9DDD6" w:sz="4"/>
               <w:left w:val="single" w:color="D9DDD6" w:sz="4"/>
@@ -9775,7 +10150,7 @@
         </w:tc>
         <w:tc>
           <w:tcPr>
-            <w:tcW w:type="dxa" w:w="2983"/>
+            <w:tcW w:type="dxa" w:w="3716"/>
             <w:tcBorders>
               <w:top w:val="single" w:color="D9DDD6" w:sz="4"/>
               <w:left w:val="single" w:color="D9DDD6" w:sz="4"/>
@@ -9805,7 +10180,7 @@
         </w:tc>
         <w:tc>
           <w:tcPr>
-            <w:tcW w:type="dxa" w:w="1047"/>
+            <w:tcW w:type="dxa" w:w="746"/>
             <w:tcBorders>
               <w:top w:val="single" w:color="D9DDD6" w:sz="4"/>
               <w:left w:val="single" w:color="D9DDD6" w:sz="4"/>
@@ -9840,7 +10215,7 @@
         </w:trPr>
         <w:tc>
           <w:tcPr>
-            <w:tcW w:type="dxa" w:w="596"/>
+            <w:tcW w:type="dxa" w:w="424"/>
             <w:tcBorders>
               <w:top w:val="single" w:color="D9DDD6" w:sz="4"/>
               <w:left w:val="single" w:color="D9DDD6" w:sz="4"/>
@@ -9872,7 +10247,7 @@
         </w:tc>
         <w:tc>
           <w:tcPr>
-            <w:tcW w:type="dxa" w:w="596"/>
+            <w:tcW w:type="dxa" w:w="424"/>
             <w:tcBorders>
               <w:top w:val="single" w:color="D9DDD6" w:sz="4"/>
               <w:left w:val="single" w:color="D9DDD6" w:sz="4"/>
@@ -9902,7 +10277,7 @@
         </w:tc>
         <w:tc>
           <w:tcPr>
-            <w:tcW w:type="dxa" w:w="3804"/>
+            <w:tcW w:type="dxa" w:w="3716"/>
             <w:tcBorders>
               <w:top w:val="single" w:color="D9DDD6" w:sz="4"/>
               <w:left w:val="single" w:color="D9DDD6" w:sz="4"/>
@@ -9932,7 +10307,7 @@
         </w:tc>
         <w:tc>
           <w:tcPr>
-            <w:tcW w:type="dxa" w:w="2983"/>
+            <w:tcW w:type="dxa" w:w="3716"/>
             <w:tcBorders>
               <w:top w:val="single" w:color="D9DDD6" w:sz="4"/>
               <w:left w:val="single" w:color="D9DDD6" w:sz="4"/>
@@ -9962,7 +10337,7 @@
         </w:tc>
         <w:tc>
           <w:tcPr>
-            <w:tcW w:type="dxa" w:w="1047"/>
+            <w:tcW w:type="dxa" w:w="746"/>
             <w:tcBorders>
               <w:top w:val="single" w:color="D9DDD6" w:sz="4"/>
               <w:left w:val="single" w:color="D9DDD6" w:sz="4"/>
@@ -9997,7 +10372,7 @@
         </w:trPr>
         <w:tc>
           <w:tcPr>
-            <w:tcW w:type="dxa" w:w="596"/>
+            <w:tcW w:type="dxa" w:w="424"/>
             <w:tcBorders>
               <w:top w:val="single" w:color="D9DDD6" w:sz="4"/>
               <w:left w:val="single" w:color="D9DDD6" w:sz="4"/>
@@ -10029,7 +10404,7 @@
         </w:tc>
         <w:tc>
           <w:tcPr>
-            <w:tcW w:type="dxa" w:w="596"/>
+            <w:tcW w:type="dxa" w:w="424"/>
             <w:tcBorders>
               <w:top w:val="single" w:color="D9DDD6" w:sz="4"/>
               <w:left w:val="single" w:color="D9DDD6" w:sz="4"/>
@@ -10059,7 +10434,7 @@
         </w:tc>
         <w:tc>
           <w:tcPr>
-            <w:tcW w:type="dxa" w:w="3804"/>
+            <w:tcW w:type="dxa" w:w="3716"/>
             <w:tcBorders>
               <w:top w:val="single" w:color="D9DDD6" w:sz="4"/>
               <w:left w:val="single" w:color="D9DDD6" w:sz="4"/>
@@ -10089,7 +10464,7 @@
         </w:tc>
         <w:tc>
           <w:tcPr>
-            <w:tcW w:type="dxa" w:w="2983"/>
+            <w:tcW w:type="dxa" w:w="3716"/>
             <w:tcBorders>
               <w:top w:val="single" w:color="D9DDD6" w:sz="4"/>
               <w:left w:val="single" w:color="D9DDD6" w:sz="4"/>
@@ -10119,7 +10494,7 @@
         </w:tc>
         <w:tc>
           <w:tcPr>
-            <w:tcW w:type="dxa" w:w="1047"/>
+            <w:tcW w:type="dxa" w:w="746"/>
             <w:tcBorders>
               <w:top w:val="single" w:color="D9DDD6" w:sz="4"/>
               <w:left w:val="single" w:color="D9DDD6" w:sz="4"/>
@@ -10154,7 +10529,7 @@
         </w:trPr>
         <w:tc>
           <w:tcPr>
-            <w:tcW w:type="dxa" w:w="596"/>
+            <w:tcW w:type="dxa" w:w="424"/>
             <w:tcBorders>
               <w:top w:val="single" w:color="D9DDD6" w:sz="4"/>
               <w:left w:val="single" w:color="D9DDD6" w:sz="4"/>
@@ -10186,7 +10561,7 @@
         </w:tc>
         <w:tc>
           <w:tcPr>
-            <w:tcW w:type="dxa" w:w="596"/>
+            <w:tcW w:type="dxa" w:w="424"/>
             <w:tcBorders>
               <w:top w:val="single" w:color="D9DDD6" w:sz="4"/>
               <w:left w:val="single" w:color="D9DDD6" w:sz="4"/>
@@ -10216,7 +10591,7 @@
         </w:tc>
         <w:tc>
           <w:tcPr>
-            <w:tcW w:type="dxa" w:w="3804"/>
+            <w:tcW w:type="dxa" w:w="3716"/>
             <w:tcBorders>
               <w:top w:val="single" w:color="D9DDD6" w:sz="4"/>
               <w:left w:val="single" w:color="D9DDD6" w:sz="4"/>
@@ -10246,7 +10621,7 @@
         </w:tc>
         <w:tc>
           <w:tcPr>
-            <w:tcW w:type="dxa" w:w="2983"/>
+            <w:tcW w:type="dxa" w:w="3716"/>
             <w:tcBorders>
               <w:top w:val="single" w:color="D9DDD6" w:sz="4"/>
               <w:left w:val="single" w:color="D9DDD6" w:sz="4"/>
@@ -10276,7 +10651,7 @@
         </w:tc>
         <w:tc>
           <w:tcPr>
-            <w:tcW w:type="dxa" w:w="1047"/>
+            <w:tcW w:type="dxa" w:w="746"/>
             <w:tcBorders>
               <w:top w:val="single" w:color="D9DDD6" w:sz="4"/>
               <w:left w:val="single" w:color="D9DDD6" w:sz="4"/>
@@ -10311,7 +10686,7 @@
         </w:trPr>
         <w:tc>
           <w:tcPr>
-            <w:tcW w:type="dxa" w:w="596"/>
+            <w:tcW w:type="dxa" w:w="424"/>
             <w:tcBorders>
               <w:top w:val="single" w:color="D9DDD6" w:sz="4"/>
               <w:left w:val="single" w:color="D9DDD6" w:sz="4"/>
@@ -10343,7 +10718,7 @@
         </w:tc>
         <w:tc>
           <w:tcPr>
-            <w:tcW w:type="dxa" w:w="596"/>
+            <w:tcW w:type="dxa" w:w="424"/>
             <w:tcBorders>
               <w:top w:val="single" w:color="D9DDD6" w:sz="4"/>
               <w:left w:val="single" w:color="D9DDD6" w:sz="4"/>
@@ -10373,7 +10748,7 @@
         </w:tc>
         <w:tc>
           <w:tcPr>
-            <w:tcW w:type="dxa" w:w="3804"/>
+            <w:tcW w:type="dxa" w:w="3716"/>
             <w:tcBorders>
               <w:top w:val="single" w:color="D9DDD6" w:sz="4"/>
               <w:left w:val="single" w:color="D9DDD6" w:sz="4"/>
@@ -10403,7 +10778,7 @@
         </w:tc>
         <w:tc>
           <w:tcPr>
-            <w:tcW w:type="dxa" w:w="2983"/>
+            <w:tcW w:type="dxa" w:w="3716"/>
             <w:tcBorders>
               <w:top w:val="single" w:color="D9DDD6" w:sz="4"/>
               <w:left w:val="single" w:color="D9DDD6" w:sz="4"/>
@@ -10433,7 +10808,7 @@
         </w:tc>
         <w:tc>
           <w:tcPr>
-            <w:tcW w:type="dxa" w:w="1047"/>
+            <w:tcW w:type="dxa" w:w="746"/>
             <w:tcBorders>
               <w:top w:val="single" w:color="D9DDD6" w:sz="4"/>
               <w:left w:val="single" w:color="D9DDD6" w:sz="4"/>
@@ -10468,7 +10843,7 @@
         </w:trPr>
         <w:tc>
           <w:tcPr>
-            <w:tcW w:type="dxa" w:w="596"/>
+            <w:tcW w:type="dxa" w:w="424"/>
             <w:tcBorders>
               <w:top w:val="single" w:color="D9DDD6" w:sz="4"/>
               <w:left w:val="single" w:color="D9DDD6" w:sz="4"/>
@@ -10500,7 +10875,7 @@
         </w:tc>
         <w:tc>
           <w:tcPr>
-            <w:tcW w:type="dxa" w:w="596"/>
+            <w:tcW w:type="dxa" w:w="424"/>
             <w:tcBorders>
               <w:top w:val="single" w:color="D9DDD6" w:sz="4"/>
               <w:left w:val="single" w:color="D9DDD6" w:sz="4"/>
@@ -10530,7 +10905,7 @@
         </w:tc>
         <w:tc>
           <w:tcPr>
-            <w:tcW w:type="dxa" w:w="3804"/>
+            <w:tcW w:type="dxa" w:w="3716"/>
             <w:tcBorders>
               <w:top w:val="single" w:color="D9DDD6" w:sz="4"/>
               <w:left w:val="single" w:color="D9DDD6" w:sz="4"/>
@@ -10560,7 +10935,7 @@
         </w:tc>
         <w:tc>
           <w:tcPr>
-            <w:tcW w:type="dxa" w:w="2983"/>
+            <w:tcW w:type="dxa" w:w="3716"/>
             <w:tcBorders>
               <w:top w:val="single" w:color="D9DDD6" w:sz="4"/>
               <w:left w:val="single" w:color="D9DDD6" w:sz="4"/>
@@ -10590,7 +10965,7 @@
         </w:tc>
         <w:tc>
           <w:tcPr>
-            <w:tcW w:type="dxa" w:w="1047"/>
+            <w:tcW w:type="dxa" w:w="746"/>
             <w:tcBorders>
               <w:top w:val="single" w:color="D9DDD6" w:sz="4"/>
               <w:left w:val="single" w:color="D9DDD6" w:sz="4"/>
@@ -10625,7 +11000,7 @@
         </w:trPr>
         <w:tc>
           <w:tcPr>
-            <w:tcW w:type="dxa" w:w="596"/>
+            <w:tcW w:type="dxa" w:w="424"/>
             <w:tcBorders>
               <w:top w:val="single" w:color="D9DDD6" w:sz="4"/>
               <w:left w:val="single" w:color="D9DDD6" w:sz="4"/>
@@ -10657,7 +11032,7 @@
         </w:tc>
         <w:tc>
           <w:tcPr>
-            <w:tcW w:type="dxa" w:w="596"/>
+            <w:tcW w:type="dxa" w:w="424"/>
             <w:tcBorders>
               <w:top w:val="single" w:color="D9DDD6" w:sz="4"/>
               <w:left w:val="single" w:color="D9DDD6" w:sz="4"/>
@@ -10687,7 +11062,7 @@
         </w:tc>
         <w:tc>
           <w:tcPr>
-            <w:tcW w:type="dxa" w:w="3804"/>
+            <w:tcW w:type="dxa" w:w="3716"/>
             <w:tcBorders>
               <w:top w:val="single" w:color="D9DDD6" w:sz="4"/>
               <w:left w:val="single" w:color="D9DDD6" w:sz="4"/>
@@ -10717,7 +11092,7 @@
         </w:tc>
         <w:tc>
           <w:tcPr>
-            <w:tcW w:type="dxa" w:w="2983"/>
+            <w:tcW w:type="dxa" w:w="3716"/>
             <w:tcBorders>
               <w:top w:val="single" w:color="D9DDD6" w:sz="4"/>
               <w:left w:val="single" w:color="D9DDD6" w:sz="4"/>
@@ -10747,7 +11122,7 @@
         </w:tc>
         <w:tc>
           <w:tcPr>
-            <w:tcW w:type="dxa" w:w="1047"/>
+            <w:tcW w:type="dxa" w:w="746"/>
             <w:tcBorders>
               <w:top w:val="single" w:color="D9DDD6" w:sz="4"/>
               <w:left w:val="single" w:color="D9DDD6" w:sz="4"/>
@@ -10782,7 +11157,7 @@
         </w:trPr>
         <w:tc>
           <w:tcPr>
-            <w:tcW w:type="dxa" w:w="596"/>
+            <w:tcW w:type="dxa" w:w="424"/>
             <w:tcBorders>
               <w:top w:val="single" w:color="D9DDD6" w:sz="4"/>
               <w:left w:val="single" w:color="D9DDD6" w:sz="4"/>
@@ -10814,7 +11189,7 @@
         </w:tc>
         <w:tc>
           <w:tcPr>
-            <w:tcW w:type="dxa" w:w="596"/>
+            <w:tcW w:type="dxa" w:w="424"/>
             <w:tcBorders>
               <w:top w:val="single" w:color="D9DDD6" w:sz="4"/>
               <w:left w:val="single" w:color="D9DDD6" w:sz="4"/>
@@ -10844,7 +11219,7 @@
         </w:tc>
         <w:tc>
           <w:tcPr>
-            <w:tcW w:type="dxa" w:w="3804"/>
+            <w:tcW w:type="dxa" w:w="3716"/>
             <w:tcBorders>
               <w:top w:val="single" w:color="D9DDD6" w:sz="4"/>
               <w:left w:val="single" w:color="D9DDD6" w:sz="4"/>
@@ -10874,7 +11249,7 @@
         </w:tc>
         <w:tc>
           <w:tcPr>
-            <w:tcW w:type="dxa" w:w="2983"/>
+            <w:tcW w:type="dxa" w:w="3716"/>
             <w:tcBorders>
               <w:top w:val="single" w:color="D9DDD6" w:sz="4"/>
               <w:left w:val="single" w:color="D9DDD6" w:sz="4"/>
@@ -10904,7 +11279,7 @@
         </w:tc>
         <w:tc>
           <w:tcPr>
-            <w:tcW w:type="dxa" w:w="1047"/>
+            <w:tcW w:type="dxa" w:w="746"/>
             <w:tcBorders>
               <w:top w:val="single" w:color="D9DDD6" w:sz="4"/>
               <w:left w:val="single" w:color="D9DDD6" w:sz="4"/>
@@ -10939,7 +11314,7 @@
         </w:trPr>
         <w:tc>
           <w:tcPr>
-            <w:tcW w:type="dxa" w:w="596"/>
+            <w:tcW w:type="dxa" w:w="424"/>
             <w:tcBorders>
               <w:top w:val="single" w:color="D9DDD6" w:sz="4"/>
               <w:left w:val="single" w:color="D9DDD6" w:sz="4"/>
@@ -10971,7 +11346,7 @@
         </w:tc>
         <w:tc>
           <w:tcPr>
-            <w:tcW w:type="dxa" w:w="596"/>
+            <w:tcW w:type="dxa" w:w="424"/>
             <w:tcBorders>
               <w:top w:val="single" w:color="D9DDD6" w:sz="4"/>
               <w:left w:val="single" w:color="D9DDD6" w:sz="4"/>
@@ -11001,7 +11376,7 @@
         </w:tc>
         <w:tc>
           <w:tcPr>
-            <w:tcW w:type="dxa" w:w="3804"/>
+            <w:tcW w:type="dxa" w:w="3716"/>
             <w:tcBorders>
               <w:top w:val="single" w:color="D9DDD6" w:sz="4"/>
               <w:left w:val="single" w:color="D9DDD6" w:sz="4"/>
@@ -11031,7 +11406,7 @@
         </w:tc>
         <w:tc>
           <w:tcPr>
-            <w:tcW w:type="dxa" w:w="2983"/>
+            <w:tcW w:type="dxa" w:w="3716"/>
             <w:tcBorders>
               <w:top w:val="single" w:color="D9DDD6" w:sz="4"/>
               <w:left w:val="single" w:color="D9DDD6" w:sz="4"/>
@@ -11061,7 +11436,7 @@
         </w:tc>
         <w:tc>
           <w:tcPr>
-            <w:tcW w:type="dxa" w:w="1047"/>
+            <w:tcW w:type="dxa" w:w="746"/>
             <w:tcBorders>
               <w:top w:val="single" w:color="D9DDD6" w:sz="4"/>
               <w:left w:val="single" w:color="D9DDD6" w:sz="4"/>
@@ -11096,7 +11471,7 @@
         </w:trPr>
         <w:tc>
           <w:tcPr>
-            <w:tcW w:type="dxa" w:w="596"/>
+            <w:tcW w:type="dxa" w:w="424"/>
             <w:tcBorders>
               <w:top w:val="single" w:color="D9DDD6" w:sz="4"/>
               <w:left w:val="single" w:color="D9DDD6" w:sz="4"/>
@@ -11128,7 +11503,7 @@
         </w:tc>
         <w:tc>
           <w:tcPr>
-            <w:tcW w:type="dxa" w:w="596"/>
+            <w:tcW w:type="dxa" w:w="424"/>
             <w:tcBorders>
               <w:top w:val="single" w:color="D9DDD6" w:sz="4"/>
               <w:left w:val="single" w:color="D9DDD6" w:sz="4"/>
@@ -11158,7 +11533,7 @@
         </w:tc>
         <w:tc>
           <w:tcPr>
-            <w:tcW w:type="dxa" w:w="3804"/>
+            <w:tcW w:type="dxa" w:w="3716"/>
             <w:tcBorders>
               <w:top w:val="single" w:color="D9DDD6" w:sz="4"/>
               <w:left w:val="single" w:color="D9DDD6" w:sz="4"/>
@@ -11188,7 +11563,7 @@
         </w:tc>
         <w:tc>
           <w:tcPr>
-            <w:tcW w:type="dxa" w:w="2983"/>
+            <w:tcW w:type="dxa" w:w="3716"/>
             <w:tcBorders>
               <w:top w:val="single" w:color="D9DDD6" w:sz="4"/>
               <w:left w:val="single" w:color="D9DDD6" w:sz="4"/>
@@ -11218,7 +11593,7 @@
         </w:tc>
         <w:tc>
           <w:tcPr>
-            <w:tcW w:type="dxa" w:w="1047"/>
+            <w:tcW w:type="dxa" w:w="746"/>
             <w:tcBorders>
               <w:top w:val="single" w:color="D9DDD6" w:sz="4"/>
               <w:left w:val="single" w:color="D9DDD6" w:sz="4"/>
@@ -11253,7 +11628,7 @@
         </w:trPr>
         <w:tc>
           <w:tcPr>
-            <w:tcW w:type="dxa" w:w="596"/>
+            <w:tcW w:type="dxa" w:w="424"/>
             <w:tcBorders>
               <w:top w:val="single" w:color="D9DDD6" w:sz="4"/>
               <w:left w:val="single" w:color="D9DDD6" w:sz="4"/>
@@ -11285,7 +11660,7 @@
         </w:tc>
         <w:tc>
           <w:tcPr>
-            <w:tcW w:type="dxa" w:w="596"/>
+            <w:tcW w:type="dxa" w:w="424"/>
             <w:tcBorders>
               <w:top w:val="single" w:color="D9DDD6" w:sz="4"/>
               <w:left w:val="single" w:color="D9DDD6" w:sz="4"/>
@@ -11315,7 +11690,7 @@
         </w:tc>
         <w:tc>
           <w:tcPr>
-            <w:tcW w:type="dxa" w:w="3804"/>
+            <w:tcW w:type="dxa" w:w="3716"/>
             <w:tcBorders>
               <w:top w:val="single" w:color="D9DDD6" w:sz="4"/>
               <w:left w:val="single" w:color="D9DDD6" w:sz="4"/>
@@ -11345,7 +11720,7 @@
         </w:tc>
         <w:tc>
           <w:tcPr>
-            <w:tcW w:type="dxa" w:w="2983"/>
+            <w:tcW w:type="dxa" w:w="3716"/>
             <w:tcBorders>
               <w:top w:val="single" w:color="D9DDD6" w:sz="4"/>
               <w:left w:val="single" w:color="D9DDD6" w:sz="4"/>
@@ -11375,7 +11750,7 @@
         </w:tc>
         <w:tc>
           <w:tcPr>
-            <w:tcW w:type="dxa" w:w="1047"/>
+            <w:tcW w:type="dxa" w:w="746"/>
             <w:tcBorders>
               <w:top w:val="single" w:color="D9DDD6" w:sz="4"/>
               <w:left w:val="single" w:color="D9DDD6" w:sz="4"/>
@@ -11410,7 +11785,7 @@
         </w:trPr>
         <w:tc>
           <w:tcPr>
-            <w:tcW w:type="dxa" w:w="596"/>
+            <w:tcW w:type="dxa" w:w="424"/>
             <w:tcBorders>
               <w:top w:val="single" w:color="D9DDD6" w:sz="4"/>
               <w:left w:val="single" w:color="D9DDD6" w:sz="4"/>
@@ -11442,7 +11817,7 @@
         </w:tc>
         <w:tc>
           <w:tcPr>
-            <w:tcW w:type="dxa" w:w="596"/>
+            <w:tcW w:type="dxa" w:w="424"/>
             <w:tcBorders>
               <w:top w:val="single" w:color="D9DDD6" w:sz="4"/>
               <w:left w:val="single" w:color="D9DDD6" w:sz="4"/>
@@ -11472,7 +11847,7 @@
         </w:tc>
         <w:tc>
           <w:tcPr>
-            <w:tcW w:type="dxa" w:w="3804"/>
+            <w:tcW w:type="dxa" w:w="3716"/>
             <w:tcBorders>
               <w:top w:val="single" w:color="D9DDD6" w:sz="4"/>
               <w:left w:val="single" w:color="D9DDD6" w:sz="4"/>
@@ -11502,7 +11877,7 @@
         </w:tc>
         <w:tc>
           <w:tcPr>
-            <w:tcW w:type="dxa" w:w="2983"/>
+            <w:tcW w:type="dxa" w:w="3716"/>
             <w:tcBorders>
               <w:top w:val="single" w:color="D9DDD6" w:sz="4"/>
               <w:left w:val="single" w:color="D9DDD6" w:sz="4"/>
@@ -11532,7 +11907,7 @@
         </w:tc>
         <w:tc>
           <w:tcPr>
-            <w:tcW w:type="dxa" w:w="1047"/>
+            <w:tcW w:type="dxa" w:w="746"/>
             <w:tcBorders>
               <w:top w:val="single" w:color="D9DDD6" w:sz="4"/>
               <w:left w:val="single" w:color="D9DDD6" w:sz="4"/>
@@ -11567,7 +11942,7 @@
         </w:trPr>
         <w:tc>
           <w:tcPr>
-            <w:tcW w:type="dxa" w:w="596"/>
+            <w:tcW w:type="dxa" w:w="424"/>
             <w:tcBorders>
               <w:top w:val="single" w:color="D9DDD6" w:sz="4"/>
               <w:left w:val="single" w:color="D9DDD6" w:sz="4"/>
@@ -11599,7 +11974,7 @@
         </w:tc>
         <w:tc>
           <w:tcPr>
-            <w:tcW w:type="dxa" w:w="596"/>
+            <w:tcW w:type="dxa" w:w="424"/>
             <w:tcBorders>
               <w:top w:val="single" w:color="D9DDD6" w:sz="4"/>
               <w:left w:val="single" w:color="D9DDD6" w:sz="4"/>
@@ -11629,7 +12004,7 @@
         </w:tc>
         <w:tc>
           <w:tcPr>
-            <w:tcW w:type="dxa" w:w="3804"/>
+            <w:tcW w:type="dxa" w:w="3716"/>
             <w:tcBorders>
               <w:top w:val="single" w:color="D9DDD6" w:sz="4"/>
               <w:left w:val="single" w:color="D9DDD6" w:sz="4"/>
@@ -11659,7 +12034,7 @@
         </w:tc>
         <w:tc>
           <w:tcPr>
-            <w:tcW w:type="dxa" w:w="2983"/>
+            <w:tcW w:type="dxa" w:w="3716"/>
             <w:tcBorders>
               <w:top w:val="single" w:color="D9DDD6" w:sz="4"/>
               <w:left w:val="single" w:color="D9DDD6" w:sz="4"/>
@@ -11689,7 +12064,7 @@
         </w:tc>
         <w:tc>
           <w:tcPr>
-            <w:tcW w:type="dxa" w:w="1047"/>
+            <w:tcW w:type="dxa" w:w="746"/>
             <w:tcBorders>
               <w:top w:val="single" w:color="D9DDD6" w:sz="4"/>
               <w:left w:val="single" w:color="D9DDD6" w:sz="4"/>
@@ -11724,7 +12099,7 @@
         </w:trPr>
         <w:tc>
           <w:tcPr>
-            <w:tcW w:type="dxa" w:w="596"/>
+            <w:tcW w:type="dxa" w:w="424"/>
             <w:tcBorders>
               <w:top w:val="single" w:color="D9DDD6" w:sz="4"/>
               <w:left w:val="single" w:color="D9DDD6" w:sz="4"/>
@@ -11756,7 +12131,7 @@
         </w:tc>
         <w:tc>
           <w:tcPr>
-            <w:tcW w:type="dxa" w:w="596"/>
+            <w:tcW w:type="dxa" w:w="424"/>
             <w:tcBorders>
               <w:top w:val="single" w:color="D9DDD6" w:sz="4"/>
               <w:left w:val="single" w:color="D9DDD6" w:sz="4"/>
@@ -11786,7 +12161,7 @@
         </w:tc>
         <w:tc>
           <w:tcPr>
-            <w:tcW w:type="dxa" w:w="3804"/>
+            <w:tcW w:type="dxa" w:w="3716"/>
             <w:tcBorders>
               <w:top w:val="single" w:color="D9DDD6" w:sz="4"/>
               <w:left w:val="single" w:color="D9DDD6" w:sz="4"/>
@@ -11816,7 +12191,7 @@
         </w:tc>
         <w:tc>
           <w:tcPr>
-            <w:tcW w:type="dxa" w:w="2983"/>
+            <w:tcW w:type="dxa" w:w="3716"/>
             <w:tcBorders>
               <w:top w:val="single" w:color="D9DDD6" w:sz="4"/>
               <w:left w:val="single" w:color="D9DDD6" w:sz="4"/>
@@ -11846,7 +12221,7 @@
         </w:tc>
         <w:tc>
           <w:tcPr>
-            <w:tcW w:type="dxa" w:w="1047"/>
+            <w:tcW w:type="dxa" w:w="746"/>
             <w:tcBorders>
               <w:top w:val="single" w:color="D9DDD6" w:sz="4"/>
               <w:left w:val="single" w:color="D9DDD6" w:sz="4"/>
@@ -11881,7 +12256,7 @@
         </w:trPr>
         <w:tc>
           <w:tcPr>
-            <w:tcW w:type="dxa" w:w="596"/>
+            <w:tcW w:type="dxa" w:w="424"/>
             <w:tcBorders>
               <w:top w:val="single" w:color="D9DDD6" w:sz="4"/>
               <w:left w:val="single" w:color="D9DDD6" w:sz="4"/>
@@ -11913,7 +12288,7 @@
         </w:tc>
         <w:tc>
           <w:tcPr>
-            <w:tcW w:type="dxa" w:w="596"/>
+            <w:tcW w:type="dxa" w:w="424"/>
             <w:tcBorders>
               <w:top w:val="single" w:color="D9DDD6" w:sz="4"/>
               <w:left w:val="single" w:color="D9DDD6" w:sz="4"/>
@@ -11943,7 +12318,7 @@
         </w:tc>
         <w:tc>
           <w:tcPr>
-            <w:tcW w:type="dxa" w:w="3804"/>
+            <w:tcW w:type="dxa" w:w="3716"/>
             <w:tcBorders>
               <w:top w:val="single" w:color="D9DDD6" w:sz="4"/>
               <w:left w:val="single" w:color="D9DDD6" w:sz="4"/>
@@ -11973,7 +12348,7 @@
         </w:tc>
         <w:tc>
           <w:tcPr>
-            <w:tcW w:type="dxa" w:w="2983"/>
+            <w:tcW w:type="dxa" w:w="3716"/>
             <w:tcBorders>
               <w:top w:val="single" w:color="D9DDD6" w:sz="4"/>
               <w:left w:val="single" w:color="D9DDD6" w:sz="4"/>
@@ -12003,7 +12378,7 @@
         </w:tc>
         <w:tc>
           <w:tcPr>
-            <w:tcW w:type="dxa" w:w="1047"/>
+            <w:tcW w:type="dxa" w:w="746"/>
             <w:tcBorders>
               <w:top w:val="single" w:color="D9DDD6" w:sz="4"/>
               <w:left w:val="single" w:color="D9DDD6" w:sz="4"/>
@@ -12028,6 +12403,320 @@
                 <w:szCs w:val="18"/>
               </w:rPr>
               <w:t xml:space="preserve">Security</w:t>
+            </w:r>
+          </w:p>
+        </w:tc>
+      </w:tr>
+      <w:tr>
+        <w:trPr>
+          <w:cantSplit/>
+        </w:trPr>
+        <w:tc>
+          <w:tcPr>
+            <w:tcW w:type="dxa" w:w="424"/>
+            <w:tcBorders>
+              <w:top w:val="single" w:color="D9DDD6" w:sz="4"/>
+              <w:left w:val="single" w:color="D9DDD6" w:sz="4"/>
+              <w:bottom w:val="single" w:color="D9DDD6" w:sz="4"/>
+              <w:right w:val="single" w:color="D9DDD6" w:sz="4"/>
+            </w:tcBorders>
+            <w:tcMar>
+              <w:top w:type="dxa" w:w="60"/>
+              <w:left w:type="dxa" w:w="100"/>
+              <w:bottom w:type="dxa" w:w="60"/>
+              <w:right w:type="dxa" w:w="100"/>
+            </w:tcMar>
+          </w:tcPr>
+          <w:p>
+            <w:pPr>
+              <w:spacing w:after="0" w:before="0"/>
+            </w:pPr>
+            <w:r>
+              <w:rPr>
+                <w:b/>
+                <w:bCs/>
+                <w:color w:val="18201C"/>
+                <w:sz w:val="18"/>
+                <w:szCs w:val="18"/>
+              </w:rPr>
+              <w:t xml:space="preserve">T-17</w:t>
+            </w:r>
+          </w:p>
+        </w:tc>
+        <w:tc>
+          <w:tcPr>
+            <w:tcW w:type="dxa" w:w="424"/>
+            <w:tcBorders>
+              <w:top w:val="single" w:color="D9DDD6" w:sz="4"/>
+              <w:left w:val="single" w:color="D9DDD6" w:sz="4"/>
+              <w:bottom w:val="single" w:color="D9DDD6" w:sz="4"/>
+              <w:right w:val="single" w:color="D9DDD6" w:sz="4"/>
+            </w:tcBorders>
+            <w:tcMar>
+              <w:top w:type="dxa" w:w="60"/>
+              <w:left w:type="dxa" w:w="100"/>
+              <w:bottom w:type="dxa" w:w="60"/>
+              <w:right w:type="dxa" w:w="100"/>
+            </w:tcMar>
+          </w:tcPr>
+          <w:p>
+            <w:pPr>
+              <w:spacing w:after="0" w:before="0"/>
+            </w:pPr>
+            <w:r>
+              <w:rPr>
+                <w:color w:val="18201C"/>
+                <w:sz w:val="18"/>
+                <w:szCs w:val="18"/>
+              </w:rPr>
+              <w:t xml:space="preserve">Unit</w:t>
+            </w:r>
+          </w:p>
+        </w:tc>
+        <w:tc>
+          <w:tcPr>
+            <w:tcW w:type="dxa" w:w="3716"/>
+            <w:tcBorders>
+              <w:top w:val="single" w:color="D9DDD6" w:sz="4"/>
+              <w:left w:val="single" w:color="D9DDD6" w:sz="4"/>
+              <w:bottom w:val="single" w:color="D9DDD6" w:sz="4"/>
+              <w:right w:val="single" w:color="D9DDD6" w:sz="4"/>
+            </w:tcBorders>
+            <w:tcMar>
+              <w:top w:type="dxa" w:w="60"/>
+              <w:left w:type="dxa" w:w="100"/>
+              <w:bottom w:type="dxa" w:w="60"/>
+              <w:right w:type="dxa" w:w="100"/>
+            </w:tcMar>
+          </w:tcPr>
+          <w:p>
+            <w:pPr>
+              <w:spacing w:after="0" w:before="0"/>
+            </w:pPr>
+            <w:r>
+              <w:rPr>
+                <w:color w:val="18201C"/>
+                <w:sz w:val="18"/>
+                <w:szCs w:val="18"/>
+              </w:rPr>
+              <w:t xml:space="preserve">Gemini reader: server down, slow, refused or odd answer; Pidgin request</w:t>
+            </w:r>
+          </w:p>
+        </w:tc>
+        <w:tc>
+          <w:tcPr>
+            <w:tcW w:type="dxa" w:w="3716"/>
+            <w:tcBorders>
+              <w:top w:val="single" w:color="D9DDD6" w:sz="4"/>
+              <w:left w:val="single" w:color="D9DDD6" w:sz="4"/>
+              <w:bottom w:val="single" w:color="D9DDD6" w:sz="4"/>
+              <w:right w:val="single" w:color="D9DDD6" w:sz="4"/>
+            </w:tcBorders>
+            <w:tcMar>
+              <w:top w:type="dxa" w:w="60"/>
+              <w:left w:type="dxa" w:w="100"/>
+              <w:bottom w:type="dxa" w:w="60"/>
+              <w:right w:type="dxa" w:w="100"/>
+            </w:tcMar>
+          </w:tcPr>
+          <w:p>
+            <w:pPr>
+              <w:spacing w:after="0" w:before="0"/>
+            </w:pPr>
+            <w:r>
+              <w:rPr>
+                <w:color w:val="18201C"/>
+                <w:sz w:val="18"/>
+                <w:szCs w:val="18"/>
+              </w:rPr>
+              <w:t xml:space="preserve">Rules answer; only the sentence and bank names are sent; yes and no never sent; the key never reaches the page</w:t>
+            </w:r>
+          </w:p>
+        </w:tc>
+        <w:tc>
+          <w:tcPr>
+            <w:tcW w:type="dxa" w:w="746"/>
+            <w:tcBorders>
+              <w:top w:val="single" w:color="D9DDD6" w:sz="4"/>
+              <w:left w:val="single" w:color="D9DDD6" w:sz="4"/>
+              <w:bottom w:val="single" w:color="D9DDD6" w:sz="4"/>
+              <w:right w:val="single" w:color="D9DDD6" w:sz="4"/>
+            </w:tcBorders>
+            <w:tcMar>
+              <w:top w:type="dxa" w:w="60"/>
+              <w:left w:type="dxa" w:w="100"/>
+              <w:bottom w:type="dxa" w:w="60"/>
+              <w:right w:type="dxa" w:w="100"/>
+            </w:tcMar>
+          </w:tcPr>
+          <w:p>
+            <w:pPr>
+              <w:spacing w:after="0" w:before="0"/>
+            </w:pPr>
+            <w:r>
+              <w:rPr>
+                <w:color w:val="18201C"/>
+                <w:sz w:val="18"/>
+                <w:szCs w:val="18"/>
+              </w:rPr>
+              <w:t xml:space="preserve">FR-26</w:t>
+            </w:r>
+          </w:p>
+        </w:tc>
+      </w:tr>
+      <w:tr>
+        <w:trPr>
+          <w:cantSplit/>
+        </w:trPr>
+        <w:tc>
+          <w:tcPr>
+            <w:tcW w:type="dxa" w:w="424"/>
+            <w:tcBorders>
+              <w:top w:val="single" w:color="D9DDD6" w:sz="4"/>
+              <w:left w:val="single" w:color="D9DDD6" w:sz="4"/>
+              <w:bottom w:val="single" w:color="D9DDD6" w:sz="4"/>
+              <w:right w:val="single" w:color="D9DDD6" w:sz="4"/>
+            </w:tcBorders>
+            <w:tcMar>
+              <w:top w:type="dxa" w:w="60"/>
+              <w:left w:type="dxa" w:w="100"/>
+              <w:bottom w:type="dxa" w:w="60"/>
+              <w:right w:type="dxa" w:w="100"/>
+            </w:tcMar>
+          </w:tcPr>
+          <w:p>
+            <w:pPr>
+              <w:spacing w:after="0" w:before="0"/>
+            </w:pPr>
+            <w:r>
+              <w:rPr>
+                <w:b/>
+                <w:bCs/>
+                <w:color w:val="18201C"/>
+                <w:sz w:val="18"/>
+                <w:szCs w:val="18"/>
+              </w:rPr>
+              <w:t xml:space="preserve">T-18</w:t>
+            </w:r>
+          </w:p>
+        </w:tc>
+        <w:tc>
+          <w:tcPr>
+            <w:tcW w:type="dxa" w:w="424"/>
+            <w:tcBorders>
+              <w:top w:val="single" w:color="D9DDD6" w:sz="4"/>
+              <w:left w:val="single" w:color="D9DDD6" w:sz="4"/>
+              <w:bottom w:val="single" w:color="D9DDD6" w:sz="4"/>
+              <w:right w:val="single" w:color="D9DDD6" w:sz="4"/>
+            </w:tcBorders>
+            <w:tcMar>
+              <w:top w:type="dxa" w:w="60"/>
+              <w:left w:type="dxa" w:w="100"/>
+              <w:bottom w:type="dxa" w:w="60"/>
+              <w:right w:type="dxa" w:w="100"/>
+            </w:tcMar>
+          </w:tcPr>
+          <w:p>
+            <w:pPr>
+              <w:spacing w:after="0" w:before="0"/>
+            </w:pPr>
+            <w:r>
+              <w:rPr>
+                <w:color w:val="18201C"/>
+                <w:sz w:val="18"/>
+                <w:szCs w:val="18"/>
+              </w:rPr>
+              <w:t xml:space="preserve">Manual</w:t>
+            </w:r>
+          </w:p>
+        </w:tc>
+        <w:tc>
+          <w:tcPr>
+            <w:tcW w:type="dxa" w:w="3716"/>
+            <w:tcBorders>
+              <w:top w:val="single" w:color="D9DDD6" w:sz="4"/>
+              <w:left w:val="single" w:color="D9DDD6" w:sz="4"/>
+              <w:bottom w:val="single" w:color="D9DDD6" w:sz="4"/>
+              <w:right w:val="single" w:color="D9DDD6" w:sz="4"/>
+            </w:tcBorders>
+            <w:tcMar>
+              <w:top w:type="dxa" w:w="60"/>
+              <w:left w:type="dxa" w:w="100"/>
+              <w:bottom w:type="dxa" w:w="60"/>
+              <w:right w:type="dxa" w:w="100"/>
+            </w:tcMar>
+          </w:tcPr>
+          <w:p>
+            <w:pPr>
+              <w:spacing w:after="0" w:before="0"/>
+            </w:pPr>
+            <w:r>
+              <w:rPr>
+                <w:color w:val="18201C"/>
+                <w:sz w:val="18"/>
+                <w:szCs w:val="18"/>
+              </w:rPr>
+              <w:t xml:space="preserve">J1 to J4 by voice, TalkBack off, Android Chrome</w:t>
+            </w:r>
+          </w:p>
+        </w:tc>
+        <w:tc>
+          <w:tcPr>
+            <w:tcW w:type="dxa" w:w="3716"/>
+            <w:tcBorders>
+              <w:top w:val="single" w:color="D9DDD6" w:sz="4"/>
+              <w:left w:val="single" w:color="D9DDD6" w:sz="4"/>
+              <w:bottom w:val="single" w:color="D9DDD6" w:sz="4"/>
+              <w:right w:val="single" w:color="D9DDD6" w:sz="4"/>
+            </w:tcBorders>
+            <w:tcMar>
+              <w:top w:type="dxa" w:w="60"/>
+              <w:left w:type="dxa" w:w="100"/>
+              <w:bottom w:type="dxa" w:w="60"/>
+              <w:right w:type="dxa" w:w="100"/>
+            </w:tcMar>
+          </w:tcPr>
+          <w:p>
+            <w:pPr>
+              <w:spacing w:after="0" w:before="0"/>
+            </w:pPr>
+            <w:r>
+              <w:rPr>
+                <w:color w:val="18201C"/>
+                <w:sz w:val="18"/>
+                <w:szCs w:val="18"/>
+              </w:rPr>
+              <w:t xml:space="preserve">No screen reader and no sighted help; a payment needs tap plus fingerprint</w:t>
+            </w:r>
+          </w:p>
+        </w:tc>
+        <w:tc>
+          <w:tcPr>
+            <w:tcW w:type="dxa" w:w="746"/>
+            <w:tcBorders>
+              <w:top w:val="single" w:color="D9DDD6" w:sz="4"/>
+              <w:left w:val="single" w:color="D9DDD6" w:sz="4"/>
+              <w:bottom w:val="single" w:color="D9DDD6" w:sz="4"/>
+              <w:right w:val="single" w:color="D9DDD6" w:sz="4"/>
+            </w:tcBorders>
+            <w:tcMar>
+              <w:top w:type="dxa" w:w="60"/>
+              <w:left w:type="dxa" w:w="100"/>
+              <w:bottom w:type="dxa" w:w="60"/>
+              <w:right w:type="dxa" w:w="100"/>
+            </w:tcMar>
+          </w:tcPr>
+          <w:p>
+            <w:pPr>
+              <w:spacing w:after="0" w:before="0"/>
+            </w:pPr>
+            <w:r>
+              <w:rPr>
+                <w:color w:val="18201C"/>
+                <w:sz w:val="18"/>
+                <w:szCs w:val="18"/>
+              </w:rPr>
+              <w:t xml:space="preserve">FR-26</w:t>
             </w:r>
           </w:p>
         </w:tc>

</xml_diff>